<commit_message>
Full content update: secretariat photos, final logo, registration link, Terra & Libertas briefs, About page, name fixes
Co-Authored-By: Claude Fable 5 <noreply@anthropic.com>
</commit_message>
<xml_diff>
--- a/STUFF/CORE SECRETRIAT AND EXECUTIVE BOARD.docx
+++ b/STUFF/CORE SECRETRIAT AND EXECUTIVE BOARD.docx
@@ -66,7 +66,28 @@
           <w:szCs w:val="26"/>
           <w:highlight w:val="white"/>
         </w:rPr>
-        <w:t>Raeed Aziz Moinudeen - Executive Director</w:t>
+        <w:t xml:space="preserve">Raeed Aziz </w:t>
+      </w:r>
+      <w:r>
+        <w:rPr>
+          <w:rFonts w:ascii="Times New Roman" w:eastAsia="Times New Roman" w:hAnsi="Times New Roman" w:cs="Times New Roman"/>
+          <w:b/>
+          <w:bCs/>
+          <w:sz w:val="26"/>
+          <w:szCs w:val="26"/>
+        </w:rPr>
+        <w:t>Moinuddin</w:t>
+      </w:r>
+      <w:r>
+        <w:rPr>
+          <w:rFonts w:ascii="Times New Roman" w:eastAsia="Times New Roman" w:hAnsi="Times New Roman" w:cs="Times New Roman"/>
+          <w:b/>
+          <w:bCs/>
+          <w:sz w:val="26"/>
+          <w:szCs w:val="26"/>
+          <w:highlight w:val="white"/>
+        </w:rPr>
+        <w:t xml:space="preserve"> - Executive Director</w:t>
       </w:r>
     </w:p>
     <w:p>
@@ -173,6 +194,40 @@
         </w:rPr>
         <w:t xml:space="preserve"> </w:t>
       </w:r>
+      <w:r>
+        <w:rPr>
+          <w:rFonts w:ascii="Times New Roman" w:eastAsia="Times New Roman" w:hAnsi="Times New Roman" w:cs="Times New Roman"/>
+          <w:b/>
+          <w:bCs/>
+          <w:sz w:val="26"/>
+          <w:szCs w:val="26"/>
+          <w:highlight w:val="white"/>
+        </w:rPr>
+        <w:t>K</w:t>
+      </w:r>
+      <w:r>
+        <w:rPr>
+          <w:rFonts w:ascii="Times New Roman" w:eastAsia="Times New Roman" w:hAnsi="Times New Roman" w:cs="Times New Roman"/>
+          <w:b/>
+          <w:bCs/>
+          <w:sz w:val="26"/>
+          <w:szCs w:val="26"/>
+          <w:highlight w:val="white"/>
+        </w:rPr>
+        <w:t>umar - Head of Delegate Affairs</w:t>
+      </w:r>
+    </w:p>
+    <w:p>
+      <w:pPr>
+        <w:rPr>
+          <w:rFonts w:ascii="Times New Roman" w:eastAsia="Times New Roman" w:hAnsi="Times New Roman" w:cs="Times New Roman"/>
+          <w:b/>
+          <w:bCs/>
+          <w:sz w:val="26"/>
+          <w:szCs w:val="26"/>
+          <w:highlight w:val="white"/>
+        </w:rPr>
+      </w:pPr>
       <w:proofErr w:type="spellStart"/>
       <w:r>
         <w:rPr>
@@ -183,7 +238,7 @@
           <w:szCs w:val="26"/>
           <w:highlight w:val="white"/>
         </w:rPr>
-        <w:t>Venkatkumar</w:t>
+        <w:t>Sisubaran</w:t>
       </w:r>
       <w:proofErr w:type="spellEnd"/>
       <w:r>
@@ -195,20 +250,54 @@
           <w:szCs w:val="26"/>
           <w:highlight w:val="white"/>
         </w:rPr>
-        <w:t xml:space="preserve"> - Head of Delegate Affairs</w:t>
-      </w:r>
-    </w:p>
-    <w:p>
-      <w:pPr>
-        <w:rPr>
-          <w:rFonts w:ascii="Times New Roman" w:eastAsia="Times New Roman" w:hAnsi="Times New Roman" w:cs="Times New Roman"/>
-          <w:b/>
-          <w:bCs/>
-          <w:sz w:val="26"/>
-          <w:szCs w:val="26"/>
-          <w:highlight w:val="white"/>
-        </w:rPr>
-      </w:pPr>
+        <w:t xml:space="preserve"> Moovendhan - Chief of Staff</w:t>
+      </w:r>
+    </w:p>
+    <w:p>
+      <w:pPr>
+        <w:rPr>
+          <w:rFonts w:ascii="Times New Roman" w:eastAsia="Times New Roman" w:hAnsi="Times New Roman" w:cs="Times New Roman"/>
+          <w:b/>
+          <w:bCs/>
+          <w:sz w:val="26"/>
+          <w:szCs w:val="26"/>
+          <w:highlight w:val="white"/>
+        </w:rPr>
+      </w:pPr>
+      <w:r>
+        <w:rPr>
+          <w:rFonts w:ascii="Times New Roman" w:eastAsia="Times New Roman" w:hAnsi="Times New Roman" w:cs="Times New Roman"/>
+          <w:b/>
+          <w:bCs/>
+          <w:sz w:val="26"/>
+          <w:szCs w:val="26"/>
+          <w:highlight w:val="white"/>
+        </w:rPr>
+        <w:t>Kavya D - Secretary of Conference</w:t>
+      </w:r>
+    </w:p>
+    <w:p>
+      <w:pPr>
+        <w:rPr>
+          <w:rFonts w:ascii="Times New Roman" w:eastAsia="Times New Roman" w:hAnsi="Times New Roman" w:cs="Times New Roman"/>
+          <w:b/>
+          <w:bCs/>
+          <w:sz w:val="26"/>
+          <w:szCs w:val="26"/>
+          <w:highlight w:val="white"/>
+        </w:rPr>
+      </w:pPr>
+      <w:r>
+        <w:rPr>
+          <w:rFonts w:ascii="Times New Roman" w:eastAsia="Times New Roman" w:hAnsi="Times New Roman" w:cs="Times New Roman"/>
+          <w:b/>
+          <w:bCs/>
+          <w:sz w:val="26"/>
+          <w:szCs w:val="26"/>
+          <w:highlight w:val="white"/>
+        </w:rPr>
+        <w:t xml:space="preserve">Lohith </w:t>
+      </w:r>
       <w:proofErr w:type="spellStart"/>
       <w:r>
         <w:rPr>
@@ -219,6 +308,494 @@
           <w:szCs w:val="26"/>
           <w:highlight w:val="white"/>
         </w:rPr>
+        <w:t>Tiruvuru</w:t>
+      </w:r>
+      <w:proofErr w:type="spellEnd"/>
+      <w:r>
+        <w:rPr>
+          <w:rFonts w:ascii="Times New Roman" w:eastAsia="Times New Roman" w:hAnsi="Times New Roman" w:cs="Times New Roman"/>
+          <w:b/>
+          <w:bCs/>
+          <w:sz w:val="26"/>
+          <w:szCs w:val="26"/>
+          <w:highlight w:val="white"/>
+        </w:rPr>
+        <w:t xml:space="preserve"> - Director of Photography</w:t>
+      </w:r>
+    </w:p>
+    <w:p>
+      <w:pPr>
+        <w:rPr>
+          <w:rFonts w:ascii="Times New Roman" w:eastAsia="Times New Roman" w:hAnsi="Times New Roman" w:cs="Times New Roman"/>
+          <w:b/>
+          <w:bCs/>
+          <w:sz w:val="26"/>
+          <w:szCs w:val="26"/>
+          <w:highlight w:val="white"/>
+        </w:rPr>
+      </w:pPr>
+    </w:p>
+    <w:p>
+      <w:pPr>
+        <w:rPr>
+          <w:rFonts w:ascii="Times New Roman" w:eastAsia="Times New Roman" w:hAnsi="Times New Roman" w:cs="Times New Roman"/>
+          <w:b/>
+          <w:bCs/>
+          <w:sz w:val="26"/>
+          <w:szCs w:val="26"/>
+          <w:highlight w:val="white"/>
+        </w:rPr>
+      </w:pPr>
+      <w:r>
+        <w:rPr>
+          <w:rFonts w:ascii="Times New Roman" w:eastAsia="Times New Roman" w:hAnsi="Times New Roman" w:cs="Times New Roman"/>
+          <w:b/>
+          <w:bCs/>
+          <w:sz w:val="26"/>
+          <w:szCs w:val="26"/>
+          <w:highlight w:val="white"/>
+        </w:rPr>
+        <w:t>EXECUTIVE BOARD</w:t>
+      </w:r>
+    </w:p>
+    <w:p>
+      <w:pPr>
+        <w:rPr>
+          <w:rFonts w:ascii="Times New Roman" w:eastAsia="Times New Roman" w:hAnsi="Times New Roman" w:cs="Times New Roman"/>
+          <w:b/>
+          <w:bCs/>
+          <w:sz w:val="26"/>
+          <w:szCs w:val="26"/>
+          <w:highlight w:val="white"/>
+        </w:rPr>
+      </w:pPr>
+      <w:r>
+        <w:rPr>
+          <w:rFonts w:ascii="Times New Roman" w:eastAsia="Times New Roman" w:hAnsi="Times New Roman" w:cs="Times New Roman"/>
+          <w:b/>
+          <w:bCs/>
+          <w:sz w:val="26"/>
+          <w:szCs w:val="26"/>
+          <w:highlight w:val="white"/>
+        </w:rPr>
+        <w:t xml:space="preserve">Forum </w:t>
+      </w:r>
+      <w:proofErr w:type="spellStart"/>
+      <w:r>
+        <w:rPr>
+          <w:rFonts w:ascii="Times New Roman" w:eastAsia="Times New Roman" w:hAnsi="Times New Roman" w:cs="Times New Roman"/>
+          <w:b/>
+          <w:bCs/>
+          <w:sz w:val="26"/>
+          <w:szCs w:val="26"/>
+          <w:highlight w:val="white"/>
+        </w:rPr>
+        <w:t>Salutis</w:t>
+      </w:r>
+      <w:proofErr w:type="spellEnd"/>
+      <w:r>
+        <w:rPr>
+          <w:rFonts w:ascii="Times New Roman" w:eastAsia="Times New Roman" w:hAnsi="Times New Roman" w:cs="Times New Roman"/>
+          <w:b/>
+          <w:bCs/>
+          <w:sz w:val="26"/>
+          <w:szCs w:val="26"/>
+          <w:highlight w:val="white"/>
+        </w:rPr>
+        <w:t xml:space="preserve"> (Health)</w:t>
+      </w:r>
+    </w:p>
+    <w:p>
+      <w:pPr>
+        <w:rPr>
+          <w:rFonts w:ascii="Times New Roman" w:eastAsia="Times New Roman" w:hAnsi="Times New Roman" w:cs="Times New Roman"/>
+          <w:b/>
+          <w:bCs/>
+          <w:sz w:val="26"/>
+          <w:szCs w:val="26"/>
+          <w:highlight w:val="white"/>
+        </w:rPr>
+      </w:pPr>
+      <w:r>
+        <w:rPr>
+          <w:rFonts w:ascii="Times New Roman" w:eastAsia="Times New Roman" w:hAnsi="Times New Roman" w:cs="Times New Roman"/>
+          <w:b/>
+          <w:bCs/>
+          <w:sz w:val="26"/>
+          <w:szCs w:val="26"/>
+          <w:highlight w:val="white"/>
+        </w:rPr>
+        <w:t xml:space="preserve">Raeed Aziz </w:t>
+      </w:r>
+      <w:r>
+        <w:rPr>
+          <w:rFonts w:ascii="Times New Roman" w:eastAsia="Times New Roman" w:hAnsi="Times New Roman" w:cs="Times New Roman"/>
+          <w:b/>
+          <w:bCs/>
+          <w:sz w:val="26"/>
+          <w:szCs w:val="26"/>
+        </w:rPr>
+        <w:t>Moinuddin</w:t>
+      </w:r>
+    </w:p>
+    <w:p>
+      <w:pPr>
+        <w:rPr>
+          <w:rFonts w:ascii="Times New Roman" w:eastAsia="Times New Roman" w:hAnsi="Times New Roman" w:cs="Times New Roman"/>
+          <w:b/>
+          <w:bCs/>
+          <w:sz w:val="26"/>
+          <w:szCs w:val="26"/>
+          <w:highlight w:val="white"/>
+        </w:rPr>
+      </w:pPr>
+      <w:proofErr w:type="spellStart"/>
+      <w:r>
+        <w:rPr>
+          <w:rFonts w:ascii="Times New Roman" w:eastAsia="Times New Roman" w:hAnsi="Times New Roman" w:cs="Times New Roman"/>
+          <w:b/>
+          <w:bCs/>
+          <w:sz w:val="26"/>
+          <w:szCs w:val="26"/>
+          <w:highlight w:val="white"/>
+        </w:rPr>
+        <w:t>Lemula</w:t>
+      </w:r>
+      <w:proofErr w:type="spellEnd"/>
+      <w:r>
+        <w:rPr>
+          <w:rFonts w:ascii="Times New Roman" w:eastAsia="Times New Roman" w:hAnsi="Times New Roman" w:cs="Times New Roman"/>
+          <w:b/>
+          <w:bCs/>
+          <w:sz w:val="26"/>
+          <w:szCs w:val="26"/>
+          <w:highlight w:val="white"/>
+        </w:rPr>
+        <w:t xml:space="preserve"> Renita</w:t>
+      </w:r>
+    </w:p>
+    <w:p>
+      <w:pPr>
+        <w:rPr>
+          <w:rFonts w:ascii="Times New Roman" w:eastAsia="Times New Roman" w:hAnsi="Times New Roman" w:cs="Times New Roman"/>
+          <w:b/>
+          <w:bCs/>
+          <w:sz w:val="26"/>
+          <w:szCs w:val="26"/>
+          <w:highlight w:val="white"/>
+        </w:rPr>
+      </w:pPr>
+      <w:r>
+        <w:rPr>
+          <w:rFonts w:ascii="Times New Roman" w:eastAsia="Times New Roman" w:hAnsi="Times New Roman" w:cs="Times New Roman"/>
+          <w:b/>
+          <w:bCs/>
+          <w:sz w:val="26"/>
+          <w:szCs w:val="26"/>
+          <w:highlight w:val="white"/>
+        </w:rPr>
+        <w:t>TBD</w:t>
+      </w:r>
+    </w:p>
+    <w:p>
+      <w:pPr>
+        <w:rPr>
+          <w:rFonts w:ascii="Times New Roman" w:eastAsia="Times New Roman" w:hAnsi="Times New Roman" w:cs="Times New Roman"/>
+          <w:b/>
+          <w:bCs/>
+          <w:sz w:val="26"/>
+          <w:szCs w:val="26"/>
+          <w:highlight w:val="white"/>
+        </w:rPr>
+      </w:pPr>
+    </w:p>
+    <w:p>
+      <w:pPr>
+        <w:rPr>
+          <w:rFonts w:ascii="Times New Roman" w:eastAsia="Times New Roman" w:hAnsi="Times New Roman" w:cs="Times New Roman"/>
+          <w:b/>
+          <w:bCs/>
+          <w:sz w:val="26"/>
+          <w:szCs w:val="26"/>
+          <w:highlight w:val="white"/>
+        </w:rPr>
+      </w:pPr>
+      <w:r>
+        <w:rPr>
+          <w:rFonts w:ascii="Times New Roman" w:eastAsia="Times New Roman" w:hAnsi="Times New Roman" w:cs="Times New Roman"/>
+          <w:b/>
+          <w:bCs/>
+          <w:sz w:val="26"/>
+          <w:szCs w:val="26"/>
+          <w:highlight w:val="white"/>
+        </w:rPr>
+        <w:t>Forum Terra (Environment)</w:t>
+      </w:r>
+    </w:p>
+    <w:p>
+      <w:pPr>
+        <w:rPr>
+          <w:rFonts w:ascii="Times New Roman" w:eastAsia="Times New Roman" w:hAnsi="Times New Roman" w:cs="Times New Roman"/>
+          <w:b/>
+          <w:bCs/>
+          <w:sz w:val="26"/>
+          <w:szCs w:val="26"/>
+          <w:highlight w:val="white"/>
+        </w:rPr>
+      </w:pPr>
+      <w:r>
+        <w:rPr>
+          <w:rFonts w:ascii="Times New Roman" w:eastAsia="Times New Roman" w:hAnsi="Times New Roman" w:cs="Times New Roman"/>
+          <w:b/>
+          <w:bCs/>
+          <w:sz w:val="26"/>
+          <w:szCs w:val="26"/>
+          <w:highlight w:val="white"/>
+        </w:rPr>
+        <w:t>Pushpak Natarajan</w:t>
+      </w:r>
+    </w:p>
+    <w:p>
+      <w:pPr>
+        <w:rPr>
+          <w:rFonts w:ascii="Times New Roman" w:eastAsia="Times New Roman" w:hAnsi="Times New Roman" w:cs="Times New Roman"/>
+          <w:b/>
+          <w:bCs/>
+          <w:sz w:val="26"/>
+          <w:szCs w:val="26"/>
+          <w:highlight w:val="white"/>
+        </w:rPr>
+      </w:pPr>
+      <w:r>
+        <w:rPr>
+          <w:rFonts w:ascii="Times New Roman" w:eastAsia="Times New Roman" w:hAnsi="Times New Roman" w:cs="Times New Roman"/>
+          <w:b/>
+          <w:bCs/>
+          <w:sz w:val="26"/>
+          <w:szCs w:val="26"/>
+          <w:highlight w:val="white"/>
+        </w:rPr>
+        <w:t>Mridula Krishnan</w:t>
+      </w:r>
+    </w:p>
+    <w:p>
+      <w:pPr>
+        <w:rPr>
+          <w:rFonts w:ascii="Times New Roman" w:eastAsia="Times New Roman" w:hAnsi="Times New Roman" w:cs="Times New Roman"/>
+          <w:b/>
+          <w:bCs/>
+          <w:sz w:val="26"/>
+          <w:szCs w:val="26"/>
+          <w:highlight w:val="white"/>
+        </w:rPr>
+      </w:pPr>
+      <w:r>
+        <w:rPr>
+          <w:rFonts w:ascii="Times New Roman" w:eastAsia="Times New Roman" w:hAnsi="Times New Roman" w:cs="Times New Roman"/>
+          <w:b/>
+          <w:bCs/>
+          <w:sz w:val="26"/>
+          <w:szCs w:val="26"/>
+          <w:highlight w:val="white"/>
+        </w:rPr>
+        <w:t>TBD</w:t>
+      </w:r>
+    </w:p>
+    <w:p>
+      <w:pPr>
+        <w:rPr>
+          <w:rFonts w:ascii="Times New Roman" w:eastAsia="Times New Roman" w:hAnsi="Times New Roman" w:cs="Times New Roman"/>
+          <w:b/>
+          <w:bCs/>
+          <w:sz w:val="26"/>
+          <w:szCs w:val="26"/>
+          <w:highlight w:val="white"/>
+        </w:rPr>
+      </w:pPr>
+    </w:p>
+    <w:p>
+      <w:pPr>
+        <w:rPr>
+          <w:rFonts w:ascii="Times New Roman" w:eastAsia="Times New Roman" w:hAnsi="Times New Roman" w:cs="Times New Roman"/>
+          <w:b/>
+          <w:bCs/>
+          <w:sz w:val="26"/>
+          <w:szCs w:val="26"/>
+          <w:highlight w:val="white"/>
+        </w:rPr>
+      </w:pPr>
+      <w:r>
+        <w:rPr>
+          <w:rFonts w:ascii="Times New Roman" w:eastAsia="Times New Roman" w:hAnsi="Times New Roman" w:cs="Times New Roman"/>
+          <w:b/>
+          <w:bCs/>
+          <w:sz w:val="26"/>
+          <w:szCs w:val="26"/>
+          <w:highlight w:val="white"/>
+        </w:rPr>
+        <w:t>Forum Mercatus (Economy)</w:t>
+      </w:r>
+    </w:p>
+    <w:p>
+      <w:pPr>
+        <w:rPr>
+          <w:rFonts w:ascii="Times New Roman" w:eastAsia="Times New Roman" w:hAnsi="Times New Roman" w:cs="Times New Roman"/>
+          <w:b/>
+          <w:bCs/>
+          <w:sz w:val="26"/>
+          <w:szCs w:val="26"/>
+          <w:highlight w:val="white"/>
+        </w:rPr>
+      </w:pPr>
+      <w:r>
+        <w:rPr>
+          <w:rFonts w:ascii="Times New Roman" w:eastAsia="Times New Roman" w:hAnsi="Times New Roman" w:cs="Times New Roman"/>
+          <w:b/>
+          <w:bCs/>
+          <w:sz w:val="26"/>
+          <w:szCs w:val="26"/>
+          <w:highlight w:val="white"/>
+        </w:rPr>
+        <w:t>Ashvardh Dinesh</w:t>
+      </w:r>
+    </w:p>
+    <w:p>
+      <w:pPr>
+        <w:rPr>
+          <w:rFonts w:ascii="Times New Roman" w:eastAsia="Times New Roman" w:hAnsi="Times New Roman" w:cs="Times New Roman"/>
+          <w:b/>
+          <w:bCs/>
+          <w:sz w:val="26"/>
+          <w:szCs w:val="26"/>
+          <w:highlight w:val="white"/>
+        </w:rPr>
+      </w:pPr>
+      <w:proofErr w:type="spellStart"/>
+      <w:r>
+        <w:rPr>
+          <w:rFonts w:ascii="Times New Roman" w:eastAsia="Times New Roman" w:hAnsi="Times New Roman" w:cs="Times New Roman"/>
+          <w:b/>
+          <w:bCs/>
+          <w:sz w:val="26"/>
+          <w:szCs w:val="26"/>
+          <w:highlight w:val="white"/>
+        </w:rPr>
+        <w:t>Chaarika</w:t>
+      </w:r>
+      <w:proofErr w:type="spellEnd"/>
+      <w:r>
+        <w:rPr>
+          <w:rFonts w:ascii="Times New Roman" w:eastAsia="Times New Roman" w:hAnsi="Times New Roman" w:cs="Times New Roman"/>
+          <w:b/>
+          <w:bCs/>
+          <w:sz w:val="26"/>
+          <w:szCs w:val="26"/>
+          <w:highlight w:val="white"/>
+        </w:rPr>
+        <w:t xml:space="preserve"> </w:t>
+      </w:r>
+      <w:r>
+        <w:rPr>
+          <w:rFonts w:ascii="Times New Roman" w:eastAsia="Times New Roman" w:hAnsi="Times New Roman" w:cs="Times New Roman"/>
+          <w:b/>
+          <w:bCs/>
+          <w:sz w:val="26"/>
+          <w:szCs w:val="26"/>
+          <w:highlight w:val="white"/>
+        </w:rPr>
+        <w:t>K</w:t>
+      </w:r>
+      <w:r>
+        <w:rPr>
+          <w:rFonts w:ascii="Times New Roman" w:eastAsia="Times New Roman" w:hAnsi="Times New Roman" w:cs="Times New Roman"/>
+          <w:b/>
+          <w:bCs/>
+          <w:sz w:val="26"/>
+          <w:szCs w:val="26"/>
+          <w:highlight w:val="white"/>
+        </w:rPr>
+        <w:t>umar</w:t>
+      </w:r>
+    </w:p>
+    <w:p>
+      <w:pPr>
+        <w:rPr>
+          <w:rFonts w:ascii="Times New Roman" w:eastAsia="Times New Roman" w:hAnsi="Times New Roman" w:cs="Times New Roman"/>
+          <w:b/>
+          <w:bCs/>
+          <w:sz w:val="26"/>
+          <w:szCs w:val="26"/>
+          <w:highlight w:val="white"/>
+        </w:rPr>
+      </w:pPr>
+      <w:r>
+        <w:rPr>
+          <w:rFonts w:ascii="Times New Roman" w:eastAsia="Times New Roman" w:hAnsi="Times New Roman" w:cs="Times New Roman"/>
+          <w:b/>
+          <w:bCs/>
+          <w:sz w:val="26"/>
+          <w:szCs w:val="26"/>
+          <w:highlight w:val="white"/>
+        </w:rPr>
+        <w:t>TBD</w:t>
+      </w:r>
+    </w:p>
+    <w:p>
+      <w:pPr>
+        <w:rPr>
+          <w:rFonts w:ascii="Times New Roman" w:eastAsia="Times New Roman" w:hAnsi="Times New Roman" w:cs="Times New Roman"/>
+          <w:b/>
+          <w:bCs/>
+          <w:sz w:val="26"/>
+          <w:szCs w:val="26"/>
+          <w:highlight w:val="white"/>
+        </w:rPr>
+      </w:pPr>
+    </w:p>
+    <w:p>
+      <w:pPr>
+        <w:rPr>
+          <w:rFonts w:ascii="Times New Roman" w:eastAsia="Times New Roman" w:hAnsi="Times New Roman" w:cs="Times New Roman"/>
+          <w:b/>
+          <w:bCs/>
+          <w:sz w:val="26"/>
+          <w:szCs w:val="26"/>
+          <w:highlight w:val="white"/>
+        </w:rPr>
+      </w:pPr>
+      <w:r>
+        <w:rPr>
+          <w:rFonts w:ascii="Times New Roman" w:eastAsia="Times New Roman" w:hAnsi="Times New Roman" w:cs="Times New Roman"/>
+          <w:b/>
+          <w:bCs/>
+          <w:sz w:val="26"/>
+          <w:szCs w:val="26"/>
+          <w:highlight w:val="white"/>
+        </w:rPr>
+        <w:t>Forum Libertas and Cultura (Human Rights and Culture)</w:t>
+      </w:r>
+    </w:p>
+    <w:p>
+      <w:pPr>
+        <w:rPr>
+          <w:rFonts w:ascii="Times New Roman" w:eastAsia="Times New Roman" w:hAnsi="Times New Roman" w:cs="Times New Roman"/>
+          <w:b/>
+          <w:bCs/>
+          <w:sz w:val="26"/>
+          <w:szCs w:val="26"/>
+          <w:highlight w:val="white"/>
+        </w:rPr>
+      </w:pPr>
+      <w:proofErr w:type="spellStart"/>
+      <w:r>
+        <w:rPr>
+          <w:rFonts w:ascii="Times New Roman" w:eastAsia="Times New Roman" w:hAnsi="Times New Roman" w:cs="Times New Roman"/>
+          <w:b/>
+          <w:bCs/>
+          <w:sz w:val="26"/>
+          <w:szCs w:val="26"/>
+          <w:highlight w:val="white"/>
+        </w:rPr>
         <w:t>Sisubaran</w:t>
       </w:r>
       <w:proofErr w:type="spellEnd"/>
@@ -231,30 +808,112 @@
           <w:szCs w:val="26"/>
           <w:highlight w:val="white"/>
         </w:rPr>
-        <w:t xml:space="preserve"> Moovendhan - Chief of Staff</w:t>
-      </w:r>
-    </w:p>
-    <w:p>
-      <w:pPr>
-        <w:rPr>
-          <w:rFonts w:ascii="Times New Roman" w:eastAsia="Times New Roman" w:hAnsi="Times New Roman" w:cs="Times New Roman"/>
-          <w:b/>
-          <w:bCs/>
-          <w:sz w:val="26"/>
-          <w:szCs w:val="26"/>
-          <w:highlight w:val="white"/>
-        </w:rPr>
-      </w:pPr>
-      <w:r>
-        <w:rPr>
-          <w:rFonts w:ascii="Times New Roman" w:eastAsia="Times New Roman" w:hAnsi="Times New Roman" w:cs="Times New Roman"/>
-          <w:b/>
-          <w:bCs/>
-          <w:sz w:val="26"/>
-          <w:szCs w:val="26"/>
-          <w:highlight w:val="white"/>
-        </w:rPr>
-        <w:t>Kavya D - Secretary of Conference</w:t>
+        <w:t xml:space="preserve"> Moovendhan</w:t>
+      </w:r>
+    </w:p>
+    <w:p>
+      <w:pPr>
+        <w:rPr>
+          <w:rFonts w:ascii="Times New Roman" w:eastAsia="Times New Roman" w:hAnsi="Times New Roman" w:cs="Times New Roman"/>
+          <w:b/>
+          <w:bCs/>
+          <w:sz w:val="26"/>
+          <w:szCs w:val="26"/>
+          <w:highlight w:val="white"/>
+        </w:rPr>
+      </w:pPr>
+      <w:r>
+        <w:rPr>
+          <w:rFonts w:ascii="Times New Roman" w:eastAsia="Times New Roman" w:hAnsi="Times New Roman" w:cs="Times New Roman"/>
+          <w:b/>
+          <w:bCs/>
+          <w:sz w:val="26"/>
+          <w:szCs w:val="26"/>
+          <w:highlight w:val="white"/>
+        </w:rPr>
+        <w:t>Kavya D</w:t>
+      </w:r>
+    </w:p>
+    <w:p>
+      <w:pPr>
+        <w:rPr>
+          <w:rFonts w:ascii="Times New Roman" w:eastAsia="Times New Roman" w:hAnsi="Times New Roman" w:cs="Times New Roman"/>
+          <w:b/>
+          <w:bCs/>
+          <w:sz w:val="26"/>
+          <w:szCs w:val="26"/>
+          <w:highlight w:val="white"/>
+        </w:rPr>
+      </w:pPr>
+      <w:r>
+        <w:rPr>
+          <w:rFonts w:ascii="Times New Roman" w:eastAsia="Times New Roman" w:hAnsi="Times New Roman" w:cs="Times New Roman"/>
+          <w:b/>
+          <w:bCs/>
+          <w:sz w:val="26"/>
+          <w:szCs w:val="26"/>
+          <w:highlight w:val="white"/>
+        </w:rPr>
+        <w:t>TBD</w:t>
+      </w:r>
+    </w:p>
+    <w:p>
+      <w:pPr>
+        <w:rPr>
+          <w:rFonts w:ascii="Times New Roman" w:eastAsia="Times New Roman" w:hAnsi="Times New Roman" w:cs="Times New Roman"/>
+          <w:b/>
+          <w:bCs/>
+          <w:sz w:val="26"/>
+          <w:szCs w:val="26"/>
+          <w:highlight w:val="white"/>
+        </w:rPr>
+      </w:pPr>
+    </w:p>
+    <w:p>
+      <w:pPr>
+        <w:rPr>
+          <w:rFonts w:ascii="Times New Roman" w:eastAsia="Times New Roman" w:hAnsi="Times New Roman" w:cs="Times New Roman"/>
+          <w:b/>
+          <w:bCs/>
+          <w:sz w:val="26"/>
+          <w:szCs w:val="26"/>
+          <w:highlight w:val="white"/>
+        </w:rPr>
+      </w:pPr>
+      <w:r>
+        <w:rPr>
+          <w:rFonts w:ascii="Times New Roman" w:eastAsia="Times New Roman" w:hAnsi="Times New Roman" w:cs="Times New Roman"/>
+          <w:b/>
+          <w:bCs/>
+          <w:sz w:val="26"/>
+          <w:szCs w:val="26"/>
+          <w:highlight w:val="white"/>
+        </w:rPr>
+        <w:t xml:space="preserve">Forum </w:t>
+      </w:r>
+      <w:proofErr w:type="spellStart"/>
+      <w:r>
+        <w:rPr>
+          <w:rFonts w:ascii="Times New Roman" w:eastAsia="Times New Roman" w:hAnsi="Times New Roman" w:cs="Times New Roman"/>
+          <w:b/>
+          <w:bCs/>
+          <w:sz w:val="26"/>
+          <w:szCs w:val="26"/>
+          <w:highlight w:val="white"/>
+        </w:rPr>
+        <w:t>Athleticum</w:t>
+      </w:r>
+      <w:proofErr w:type="spellEnd"/>
+      <w:r>
+        <w:rPr>
+          <w:rFonts w:ascii="Times New Roman" w:eastAsia="Times New Roman" w:hAnsi="Times New Roman" w:cs="Times New Roman"/>
+          <w:b/>
+          <w:bCs/>
+          <w:sz w:val="26"/>
+          <w:szCs w:val="26"/>
+          <w:highlight w:val="white"/>
+        </w:rPr>
+        <w:t xml:space="preserve"> (Sports)</w:t>
       </w:r>
     </w:p>
     <w:p>
@@ -301,651 +960,30 @@
           <w:szCs w:val="26"/>
           <w:highlight w:val="white"/>
         </w:rPr>
-        <w:t xml:space="preserve"> - Director of Photography</w:t>
-      </w:r>
-    </w:p>
-    <w:p>
-      <w:pPr>
-        <w:rPr>
-          <w:rFonts w:ascii="Times New Roman" w:eastAsia="Times New Roman" w:hAnsi="Times New Roman" w:cs="Times New Roman"/>
-          <w:b/>
-          <w:bCs/>
-          <w:sz w:val="26"/>
-          <w:szCs w:val="26"/>
-          <w:highlight w:val="white"/>
-        </w:rPr>
-      </w:pPr>
-    </w:p>
-    <w:p>
-      <w:pPr>
-        <w:rPr>
-          <w:rFonts w:ascii="Times New Roman" w:eastAsia="Times New Roman" w:hAnsi="Times New Roman" w:cs="Times New Roman"/>
-          <w:b/>
-          <w:bCs/>
-          <w:sz w:val="26"/>
-          <w:szCs w:val="26"/>
-          <w:highlight w:val="white"/>
-        </w:rPr>
-      </w:pPr>
-      <w:r>
-        <w:rPr>
-          <w:rFonts w:ascii="Times New Roman" w:eastAsia="Times New Roman" w:hAnsi="Times New Roman" w:cs="Times New Roman"/>
-          <w:b/>
-          <w:bCs/>
-          <w:sz w:val="26"/>
-          <w:szCs w:val="26"/>
-          <w:highlight w:val="white"/>
-        </w:rPr>
-        <w:t>EXECUTIVE BOARD</w:t>
-      </w:r>
-    </w:p>
-    <w:p>
-      <w:pPr>
-        <w:rPr>
-          <w:rFonts w:ascii="Times New Roman" w:eastAsia="Times New Roman" w:hAnsi="Times New Roman" w:cs="Times New Roman"/>
-          <w:b/>
-          <w:bCs/>
-          <w:sz w:val="26"/>
-          <w:szCs w:val="26"/>
-          <w:highlight w:val="white"/>
-        </w:rPr>
-      </w:pPr>
-      <w:r>
-        <w:rPr>
-          <w:rFonts w:ascii="Times New Roman" w:eastAsia="Times New Roman" w:hAnsi="Times New Roman" w:cs="Times New Roman"/>
-          <w:b/>
-          <w:bCs/>
-          <w:sz w:val="26"/>
-          <w:szCs w:val="26"/>
-          <w:highlight w:val="white"/>
-        </w:rPr>
-        <w:t xml:space="preserve">Forum </w:t>
-      </w:r>
-      <w:proofErr w:type="spellStart"/>
-      <w:r>
-        <w:rPr>
-          <w:rFonts w:ascii="Times New Roman" w:eastAsia="Times New Roman" w:hAnsi="Times New Roman" w:cs="Times New Roman"/>
-          <w:b/>
-          <w:bCs/>
-          <w:sz w:val="26"/>
-          <w:szCs w:val="26"/>
-          <w:highlight w:val="white"/>
-        </w:rPr>
-        <w:t>Salutis</w:t>
-      </w:r>
-      <w:proofErr w:type="spellEnd"/>
-      <w:r>
-        <w:rPr>
-          <w:rFonts w:ascii="Times New Roman" w:eastAsia="Times New Roman" w:hAnsi="Times New Roman" w:cs="Times New Roman"/>
-          <w:b/>
-          <w:bCs/>
-          <w:sz w:val="26"/>
-          <w:szCs w:val="26"/>
-          <w:highlight w:val="white"/>
-        </w:rPr>
-        <w:t xml:space="preserve"> (Health)</w:t>
-      </w:r>
-    </w:p>
-    <w:p>
-      <w:pPr>
-        <w:rPr>
-          <w:rFonts w:ascii="Times New Roman" w:eastAsia="Times New Roman" w:hAnsi="Times New Roman" w:cs="Times New Roman"/>
-          <w:b/>
-          <w:bCs/>
-          <w:sz w:val="26"/>
-          <w:szCs w:val="26"/>
-          <w:highlight w:val="white"/>
-        </w:rPr>
-      </w:pPr>
-      <w:r>
-        <w:rPr>
-          <w:rFonts w:ascii="Times New Roman" w:eastAsia="Times New Roman" w:hAnsi="Times New Roman" w:cs="Times New Roman"/>
-          <w:b/>
-          <w:bCs/>
-          <w:sz w:val="26"/>
-          <w:szCs w:val="26"/>
-          <w:highlight w:val="white"/>
-        </w:rPr>
-        <w:t>Raeed Aziz Moinudeen</w:t>
-      </w:r>
-    </w:p>
-    <w:p>
-      <w:pPr>
-        <w:rPr>
-          <w:rFonts w:ascii="Times New Roman" w:eastAsia="Times New Roman" w:hAnsi="Times New Roman" w:cs="Times New Roman"/>
-          <w:b/>
-          <w:bCs/>
-          <w:sz w:val="26"/>
-          <w:szCs w:val="26"/>
-          <w:highlight w:val="white"/>
-        </w:rPr>
-      </w:pPr>
-      <w:r>
-        <w:rPr>
-          <w:rFonts w:ascii="Times New Roman" w:eastAsia="Times New Roman" w:hAnsi="Times New Roman" w:cs="Times New Roman"/>
-          <w:b/>
-          <w:bCs/>
-          <w:sz w:val="26"/>
-          <w:szCs w:val="26"/>
-          <w:highlight w:val="white"/>
-        </w:rPr>
-        <w:t>TBD</w:t>
-      </w:r>
-    </w:p>
-    <w:p>
-      <w:pPr>
-        <w:rPr>
-          <w:rFonts w:ascii="Times New Roman" w:eastAsia="Times New Roman" w:hAnsi="Times New Roman" w:cs="Times New Roman"/>
-          <w:b/>
-          <w:bCs/>
-          <w:sz w:val="26"/>
-          <w:szCs w:val="26"/>
-          <w:highlight w:val="white"/>
-        </w:rPr>
-      </w:pPr>
-      <w:r>
-        <w:rPr>
-          <w:rFonts w:ascii="Times New Roman" w:eastAsia="Times New Roman" w:hAnsi="Times New Roman" w:cs="Times New Roman"/>
-          <w:b/>
-          <w:bCs/>
-          <w:sz w:val="26"/>
-          <w:szCs w:val="26"/>
-          <w:highlight w:val="white"/>
-        </w:rPr>
-        <w:t>TBD</w:t>
-      </w:r>
-    </w:p>
-    <w:p>
-      <w:pPr>
-        <w:rPr>
-          <w:rFonts w:ascii="Times New Roman" w:eastAsia="Times New Roman" w:hAnsi="Times New Roman" w:cs="Times New Roman"/>
-          <w:b/>
-          <w:bCs/>
-          <w:sz w:val="26"/>
-          <w:szCs w:val="26"/>
-          <w:highlight w:val="white"/>
-        </w:rPr>
-      </w:pPr>
-    </w:p>
-    <w:p>
-      <w:pPr>
-        <w:rPr>
-          <w:rFonts w:ascii="Times New Roman" w:eastAsia="Times New Roman" w:hAnsi="Times New Roman" w:cs="Times New Roman"/>
-          <w:b/>
-          <w:bCs/>
-          <w:sz w:val="26"/>
-          <w:szCs w:val="26"/>
-          <w:highlight w:val="white"/>
-        </w:rPr>
-      </w:pPr>
-      <w:r>
-        <w:rPr>
-          <w:rFonts w:ascii="Times New Roman" w:eastAsia="Times New Roman" w:hAnsi="Times New Roman" w:cs="Times New Roman"/>
-          <w:b/>
-          <w:bCs/>
-          <w:sz w:val="26"/>
-          <w:szCs w:val="26"/>
-          <w:highlight w:val="white"/>
-        </w:rPr>
-        <w:t>Forum Terra (Environment)</w:t>
-      </w:r>
-    </w:p>
-    <w:p>
-      <w:pPr>
-        <w:rPr>
-          <w:rFonts w:ascii="Times New Roman" w:eastAsia="Times New Roman" w:hAnsi="Times New Roman" w:cs="Times New Roman"/>
-          <w:b/>
-          <w:bCs/>
-          <w:sz w:val="26"/>
-          <w:szCs w:val="26"/>
-          <w:highlight w:val="white"/>
-        </w:rPr>
-      </w:pPr>
-      <w:r>
-        <w:rPr>
-          <w:rFonts w:ascii="Times New Roman" w:eastAsia="Times New Roman" w:hAnsi="Times New Roman" w:cs="Times New Roman"/>
-          <w:b/>
-          <w:bCs/>
-          <w:sz w:val="26"/>
-          <w:szCs w:val="26"/>
-          <w:highlight w:val="white"/>
-        </w:rPr>
-        <w:t>Pushpak Natarajan</w:t>
-      </w:r>
-    </w:p>
-    <w:p>
-      <w:pPr>
-        <w:rPr>
-          <w:rFonts w:ascii="Times New Roman" w:eastAsia="Times New Roman" w:hAnsi="Times New Roman" w:cs="Times New Roman"/>
-          <w:b/>
-          <w:bCs/>
-          <w:sz w:val="26"/>
-          <w:szCs w:val="26"/>
-          <w:highlight w:val="white"/>
-        </w:rPr>
-      </w:pPr>
-      <w:r>
-        <w:rPr>
-          <w:rFonts w:ascii="Times New Roman" w:eastAsia="Times New Roman" w:hAnsi="Times New Roman" w:cs="Times New Roman"/>
-          <w:b/>
-          <w:bCs/>
-          <w:sz w:val="26"/>
-          <w:szCs w:val="26"/>
-          <w:highlight w:val="white"/>
-        </w:rPr>
-        <w:t>Mridula Krishnan</w:t>
-      </w:r>
-    </w:p>
-    <w:p>
-      <w:pPr>
-        <w:rPr>
-          <w:rFonts w:ascii="Times New Roman" w:eastAsia="Times New Roman" w:hAnsi="Times New Roman" w:cs="Times New Roman"/>
-          <w:b/>
-          <w:bCs/>
-          <w:sz w:val="26"/>
-          <w:szCs w:val="26"/>
-          <w:highlight w:val="white"/>
-        </w:rPr>
-      </w:pPr>
-      <w:r>
-        <w:rPr>
-          <w:rFonts w:ascii="Times New Roman" w:eastAsia="Times New Roman" w:hAnsi="Times New Roman" w:cs="Times New Roman"/>
-          <w:b/>
-          <w:bCs/>
-          <w:sz w:val="26"/>
-          <w:szCs w:val="26"/>
-          <w:highlight w:val="white"/>
-        </w:rPr>
-        <w:t>TBD</w:t>
-      </w:r>
-    </w:p>
-    <w:p>
-      <w:pPr>
-        <w:rPr>
-          <w:rFonts w:ascii="Times New Roman" w:eastAsia="Times New Roman" w:hAnsi="Times New Roman" w:cs="Times New Roman"/>
-          <w:b/>
-          <w:bCs/>
-          <w:sz w:val="26"/>
-          <w:szCs w:val="26"/>
-          <w:highlight w:val="white"/>
-        </w:rPr>
-      </w:pPr>
-    </w:p>
-    <w:p>
-      <w:pPr>
-        <w:rPr>
-          <w:rFonts w:ascii="Times New Roman" w:eastAsia="Times New Roman" w:hAnsi="Times New Roman" w:cs="Times New Roman"/>
-          <w:b/>
-          <w:bCs/>
-          <w:sz w:val="26"/>
-          <w:szCs w:val="26"/>
-          <w:highlight w:val="white"/>
-        </w:rPr>
-      </w:pPr>
-      <w:r>
-        <w:rPr>
-          <w:rFonts w:ascii="Times New Roman" w:eastAsia="Times New Roman" w:hAnsi="Times New Roman" w:cs="Times New Roman"/>
-          <w:b/>
-          <w:bCs/>
-          <w:sz w:val="26"/>
-          <w:szCs w:val="26"/>
-          <w:highlight w:val="white"/>
-        </w:rPr>
-        <w:t>Forum Mercatus (Economy)</w:t>
-      </w:r>
-    </w:p>
-    <w:p>
-      <w:pPr>
-        <w:rPr>
-          <w:rFonts w:ascii="Times New Roman" w:eastAsia="Times New Roman" w:hAnsi="Times New Roman" w:cs="Times New Roman"/>
-          <w:b/>
-          <w:bCs/>
-          <w:sz w:val="26"/>
-          <w:szCs w:val="26"/>
-          <w:highlight w:val="white"/>
-        </w:rPr>
-      </w:pPr>
-      <w:r>
-        <w:rPr>
-          <w:rFonts w:ascii="Times New Roman" w:eastAsia="Times New Roman" w:hAnsi="Times New Roman" w:cs="Times New Roman"/>
-          <w:b/>
-          <w:bCs/>
-          <w:sz w:val="26"/>
-          <w:szCs w:val="26"/>
-          <w:highlight w:val="white"/>
-        </w:rPr>
-        <w:t>Ashvardh Dinesh</w:t>
-      </w:r>
-    </w:p>
-    <w:p>
-      <w:pPr>
-        <w:rPr>
-          <w:rFonts w:ascii="Times New Roman" w:eastAsia="Times New Roman" w:hAnsi="Times New Roman" w:cs="Times New Roman"/>
-          <w:b/>
-          <w:bCs/>
-          <w:sz w:val="26"/>
-          <w:szCs w:val="26"/>
-          <w:highlight w:val="white"/>
-        </w:rPr>
-      </w:pPr>
-      <w:proofErr w:type="spellStart"/>
-      <w:r>
-        <w:rPr>
-          <w:rFonts w:ascii="Times New Roman" w:eastAsia="Times New Roman" w:hAnsi="Times New Roman" w:cs="Times New Roman"/>
-          <w:b/>
-          <w:bCs/>
-          <w:sz w:val="26"/>
-          <w:szCs w:val="26"/>
-          <w:highlight w:val="white"/>
-        </w:rPr>
-        <w:t>Chaarika</w:t>
-      </w:r>
-      <w:proofErr w:type="spellEnd"/>
-      <w:r>
-        <w:rPr>
-          <w:rFonts w:ascii="Times New Roman" w:eastAsia="Times New Roman" w:hAnsi="Times New Roman" w:cs="Times New Roman"/>
-          <w:b/>
-          <w:bCs/>
-          <w:sz w:val="26"/>
-          <w:szCs w:val="26"/>
-          <w:highlight w:val="white"/>
-        </w:rPr>
         <w:t xml:space="preserve"> </w:t>
       </w:r>
-      <w:proofErr w:type="spellStart"/>
-      <w:r>
-        <w:rPr>
-          <w:rFonts w:ascii="Times New Roman" w:eastAsia="Times New Roman" w:hAnsi="Times New Roman" w:cs="Times New Roman"/>
-          <w:b/>
-          <w:bCs/>
-          <w:sz w:val="26"/>
-          <w:szCs w:val="26"/>
-          <w:highlight w:val="white"/>
-        </w:rPr>
-        <w:t>Venkatkumar</w:t>
-      </w:r>
-      <w:proofErr w:type="spellEnd"/>
-    </w:p>
-    <w:p>
-      <w:pPr>
-        <w:rPr>
-          <w:rFonts w:ascii="Times New Roman" w:eastAsia="Times New Roman" w:hAnsi="Times New Roman" w:cs="Times New Roman"/>
-          <w:b/>
-          <w:bCs/>
-          <w:sz w:val="26"/>
-          <w:szCs w:val="26"/>
-          <w:highlight w:val="white"/>
-        </w:rPr>
-      </w:pPr>
-      <w:r>
-        <w:rPr>
-          <w:rFonts w:ascii="Times New Roman" w:eastAsia="Times New Roman" w:hAnsi="Times New Roman" w:cs="Times New Roman"/>
-          <w:b/>
-          <w:bCs/>
-          <w:sz w:val="26"/>
-          <w:szCs w:val="26"/>
-          <w:highlight w:val="white"/>
-        </w:rPr>
-        <w:t>TBD</w:t>
-      </w:r>
-    </w:p>
-    <w:p>
-      <w:pPr>
-        <w:rPr>
-          <w:rFonts w:ascii="Times New Roman" w:eastAsia="Times New Roman" w:hAnsi="Times New Roman" w:cs="Times New Roman"/>
-          <w:b/>
-          <w:bCs/>
-          <w:sz w:val="26"/>
-          <w:szCs w:val="26"/>
-          <w:highlight w:val="white"/>
-        </w:rPr>
-      </w:pPr>
-    </w:p>
-    <w:p>
-      <w:pPr>
-        <w:rPr>
-          <w:rFonts w:ascii="Times New Roman" w:eastAsia="Times New Roman" w:hAnsi="Times New Roman" w:cs="Times New Roman"/>
-          <w:b/>
-          <w:bCs/>
-          <w:sz w:val="26"/>
-          <w:szCs w:val="26"/>
-          <w:highlight w:val="white"/>
-        </w:rPr>
-      </w:pPr>
-      <w:r>
-        <w:rPr>
-          <w:rFonts w:ascii="Times New Roman" w:eastAsia="Times New Roman" w:hAnsi="Times New Roman" w:cs="Times New Roman"/>
-          <w:b/>
-          <w:bCs/>
-          <w:sz w:val="26"/>
-          <w:szCs w:val="26"/>
-          <w:highlight w:val="white"/>
-        </w:rPr>
-        <w:t>Forum Libertas and Cultura (Human Rights and Culture)</w:t>
-      </w:r>
-    </w:p>
-    <w:p>
-      <w:pPr>
-        <w:rPr>
-          <w:rFonts w:ascii="Times New Roman" w:eastAsia="Times New Roman" w:hAnsi="Times New Roman" w:cs="Times New Roman"/>
-          <w:b/>
-          <w:bCs/>
-          <w:sz w:val="26"/>
-          <w:szCs w:val="26"/>
-          <w:highlight w:val="white"/>
-        </w:rPr>
-      </w:pPr>
-      <w:proofErr w:type="spellStart"/>
-      <w:r>
-        <w:rPr>
-          <w:rFonts w:ascii="Times New Roman" w:eastAsia="Times New Roman" w:hAnsi="Times New Roman" w:cs="Times New Roman"/>
-          <w:b/>
-          <w:bCs/>
-          <w:sz w:val="26"/>
-          <w:szCs w:val="26"/>
-          <w:highlight w:val="white"/>
-        </w:rPr>
-        <w:t>Sisubaran</w:t>
-      </w:r>
-      <w:proofErr w:type="spellEnd"/>
-      <w:r>
-        <w:rPr>
-          <w:rFonts w:ascii="Times New Roman" w:eastAsia="Times New Roman" w:hAnsi="Times New Roman" w:cs="Times New Roman"/>
-          <w:b/>
-          <w:bCs/>
-          <w:sz w:val="26"/>
-          <w:szCs w:val="26"/>
-          <w:highlight w:val="white"/>
-        </w:rPr>
-        <w:t xml:space="preserve"> Moovendhan</w:t>
-      </w:r>
-    </w:p>
-    <w:p>
-      <w:pPr>
-        <w:rPr>
-          <w:rFonts w:ascii="Times New Roman" w:eastAsia="Times New Roman" w:hAnsi="Times New Roman" w:cs="Times New Roman"/>
-          <w:b/>
-          <w:bCs/>
-          <w:sz w:val="26"/>
-          <w:szCs w:val="26"/>
-          <w:highlight w:val="white"/>
-        </w:rPr>
-      </w:pPr>
-      <w:r>
-        <w:rPr>
-          <w:rFonts w:ascii="Times New Roman" w:eastAsia="Times New Roman" w:hAnsi="Times New Roman" w:cs="Times New Roman"/>
-          <w:b/>
-          <w:bCs/>
-          <w:sz w:val="26"/>
-          <w:szCs w:val="26"/>
-          <w:highlight w:val="white"/>
-        </w:rPr>
-        <w:t xml:space="preserve">Kavya </w:t>
-      </w:r>
-      <w:proofErr w:type="spellStart"/>
-      <w:r>
-        <w:rPr>
-          <w:rFonts w:ascii="Times New Roman" w:eastAsia="Times New Roman" w:hAnsi="Times New Roman" w:cs="Times New Roman"/>
-          <w:b/>
-          <w:bCs/>
-          <w:sz w:val="26"/>
-          <w:szCs w:val="26"/>
-          <w:highlight w:val="white"/>
-        </w:rPr>
-        <w:t>Dhiriaiviyam</w:t>
-      </w:r>
-      <w:proofErr w:type="spellEnd"/>
-    </w:p>
-    <w:p>
-      <w:pPr>
-        <w:rPr>
-          <w:rFonts w:ascii="Times New Roman" w:eastAsia="Times New Roman" w:hAnsi="Times New Roman" w:cs="Times New Roman"/>
-          <w:b/>
-          <w:bCs/>
-          <w:sz w:val="26"/>
-          <w:szCs w:val="26"/>
-          <w:highlight w:val="white"/>
-        </w:rPr>
-      </w:pPr>
-      <w:r>
-        <w:rPr>
-          <w:rFonts w:ascii="Times New Roman" w:eastAsia="Times New Roman" w:hAnsi="Times New Roman" w:cs="Times New Roman"/>
-          <w:b/>
-          <w:bCs/>
-          <w:sz w:val="26"/>
-          <w:szCs w:val="26"/>
-          <w:highlight w:val="white"/>
-        </w:rPr>
-        <w:t>TBD</w:t>
-      </w:r>
-    </w:p>
-    <w:p>
-      <w:pPr>
-        <w:rPr>
-          <w:rFonts w:ascii="Times New Roman" w:eastAsia="Times New Roman" w:hAnsi="Times New Roman" w:cs="Times New Roman"/>
-          <w:b/>
-          <w:bCs/>
-          <w:sz w:val="26"/>
-          <w:szCs w:val="26"/>
-          <w:highlight w:val="white"/>
-        </w:rPr>
-      </w:pPr>
-    </w:p>
-    <w:p>
-      <w:pPr>
-        <w:rPr>
-          <w:rFonts w:ascii="Times New Roman" w:eastAsia="Times New Roman" w:hAnsi="Times New Roman" w:cs="Times New Roman"/>
-          <w:b/>
-          <w:bCs/>
-          <w:sz w:val="26"/>
-          <w:szCs w:val="26"/>
-          <w:highlight w:val="white"/>
-        </w:rPr>
-      </w:pPr>
-      <w:r>
-        <w:rPr>
-          <w:rFonts w:ascii="Times New Roman" w:eastAsia="Times New Roman" w:hAnsi="Times New Roman" w:cs="Times New Roman"/>
-          <w:b/>
-          <w:bCs/>
-          <w:sz w:val="26"/>
-          <w:szCs w:val="26"/>
-          <w:highlight w:val="white"/>
-        </w:rPr>
-        <w:t xml:space="preserve">Forum </w:t>
-      </w:r>
-      <w:proofErr w:type="spellStart"/>
-      <w:r>
-        <w:rPr>
-          <w:rFonts w:ascii="Times New Roman" w:eastAsia="Times New Roman" w:hAnsi="Times New Roman" w:cs="Times New Roman"/>
-          <w:b/>
-          <w:bCs/>
-          <w:sz w:val="26"/>
-          <w:szCs w:val="26"/>
-          <w:highlight w:val="white"/>
-        </w:rPr>
-        <w:t>Athleticum</w:t>
-      </w:r>
-      <w:proofErr w:type="spellEnd"/>
-      <w:r>
-        <w:rPr>
-          <w:rFonts w:ascii="Times New Roman" w:eastAsia="Times New Roman" w:hAnsi="Times New Roman" w:cs="Times New Roman"/>
-          <w:b/>
-          <w:bCs/>
-          <w:sz w:val="26"/>
-          <w:szCs w:val="26"/>
-          <w:highlight w:val="white"/>
-        </w:rPr>
-        <w:t xml:space="preserve"> (Sports)</w:t>
-      </w:r>
-    </w:p>
-    <w:p>
-      <w:pPr>
-        <w:rPr>
-          <w:rFonts w:ascii="Times New Roman" w:eastAsia="Times New Roman" w:hAnsi="Times New Roman" w:cs="Times New Roman"/>
-          <w:b/>
-          <w:bCs/>
-          <w:sz w:val="26"/>
-          <w:szCs w:val="26"/>
-          <w:highlight w:val="white"/>
-        </w:rPr>
-      </w:pPr>
-      <w:r>
-        <w:rPr>
-          <w:rFonts w:ascii="Times New Roman" w:eastAsia="Times New Roman" w:hAnsi="Times New Roman" w:cs="Times New Roman"/>
-          <w:b/>
-          <w:bCs/>
-          <w:sz w:val="26"/>
-          <w:szCs w:val="26"/>
-          <w:highlight w:val="white"/>
-        </w:rPr>
-        <w:t xml:space="preserve">Lohith </w:t>
-      </w:r>
-      <w:proofErr w:type="spellStart"/>
-      <w:r>
-        <w:rPr>
-          <w:rFonts w:ascii="Times New Roman" w:eastAsia="Times New Roman" w:hAnsi="Times New Roman" w:cs="Times New Roman"/>
-          <w:b/>
-          <w:bCs/>
-          <w:sz w:val="26"/>
-          <w:szCs w:val="26"/>
-          <w:highlight w:val="white"/>
-        </w:rPr>
-        <w:t>Tiruvuru</w:t>
-      </w:r>
-      <w:proofErr w:type="spellEnd"/>
-      <w:r>
-        <w:rPr>
-          <w:rFonts w:ascii="Times New Roman" w:eastAsia="Times New Roman" w:hAnsi="Times New Roman" w:cs="Times New Roman"/>
-          <w:b/>
-          <w:bCs/>
-          <w:sz w:val="26"/>
-          <w:szCs w:val="26"/>
-          <w:highlight w:val="white"/>
-        </w:rPr>
-        <w:t xml:space="preserve"> </w:t>
-      </w:r>
-    </w:p>
-    <w:p>
-      <w:pPr>
-        <w:rPr>
-          <w:rFonts w:ascii="Times New Roman" w:eastAsia="Times New Roman" w:hAnsi="Times New Roman" w:cs="Times New Roman"/>
-          <w:b/>
-          <w:bCs/>
-          <w:sz w:val="26"/>
-          <w:szCs w:val="26"/>
-          <w:highlight w:val="white"/>
-        </w:rPr>
-      </w:pPr>
-      <w:r>
-        <w:rPr>
-          <w:rFonts w:ascii="Times New Roman" w:eastAsia="Times New Roman" w:hAnsi="Times New Roman" w:cs="Times New Roman"/>
-          <w:b/>
-          <w:bCs/>
-          <w:sz w:val="26"/>
-          <w:szCs w:val="26"/>
-          <w:highlight w:val="white"/>
-        </w:rPr>
-        <w:t>TBD</w:t>
+    </w:p>
+    <w:p>
+      <w:pPr>
+        <w:rPr>
+          <w:rFonts w:ascii="Times New Roman" w:eastAsia="Times New Roman" w:hAnsi="Times New Roman" w:cs="Times New Roman"/>
+          <w:b/>
+          <w:bCs/>
+          <w:sz w:val="26"/>
+          <w:szCs w:val="26"/>
+          <w:highlight w:val="white"/>
+        </w:rPr>
+      </w:pPr>
+      <w:r>
+        <w:rPr>
+          <w:rFonts w:ascii="Times New Roman" w:eastAsia="Times New Roman" w:hAnsi="Times New Roman" w:cs="Times New Roman"/>
+          <w:b/>
+          <w:bCs/>
+          <w:sz w:val="26"/>
+          <w:szCs w:val="26"/>
+          <w:highlight w:val="white"/>
+        </w:rPr>
+        <w:t>Adarsh Nathan</w:t>
       </w:r>
     </w:p>
     <w:p>
@@ -1015,7 +1053,7 @@
           <w:szCs w:val="26"/>
           <w:highlight w:val="white"/>
         </w:rPr>
-        <w:t xml:space="preserve">TBD </w:t>
+        <w:t>Deva</w:t>
       </w:r>
     </w:p>
     <w:p>
@@ -1061,21 +1099,42 @@
           <w:szCs w:val="26"/>
           <w:highlight w:val="white"/>
         </w:rPr>
-        <w:t xml:space="preserve">TBD </w:t>
-      </w:r>
-      <w:proofErr w:type="spellStart"/>
-      <w:r>
-        <w:rPr>
-          <w:rFonts w:ascii="Times New Roman" w:eastAsia="Times New Roman" w:hAnsi="Times New Roman" w:cs="Times New Roman"/>
-          <w:b/>
-          <w:bCs/>
-          <w:sz w:val="26"/>
-          <w:szCs w:val="26"/>
-          <w:highlight w:val="white"/>
-        </w:rPr>
         <w:t>TBD</w:t>
       </w:r>
-      <w:proofErr w:type="spellEnd"/>
+    </w:p>
+    <w:p>
+      <w:pPr>
+        <w:rPr>
+          <w:rFonts w:ascii="Times New Roman" w:eastAsia="Times New Roman" w:hAnsi="Times New Roman" w:cs="Times New Roman"/>
+          <w:b/>
+          <w:bCs/>
+          <w:sz w:val="26"/>
+          <w:szCs w:val="26"/>
+          <w:highlight w:val="white"/>
+        </w:rPr>
+      </w:pPr>
+      <w:r>
+        <w:rPr>
+          <w:rFonts w:ascii="Times New Roman" w:eastAsia="Times New Roman" w:hAnsi="Times New Roman" w:cs="Times New Roman"/>
+          <w:b/>
+          <w:bCs/>
+          <w:sz w:val="26"/>
+          <w:szCs w:val="26"/>
+          <w:highlight w:val="white"/>
+        </w:rPr>
+        <w:t>T</w:t>
+      </w:r>
+      <w:r>
+        <w:rPr>
+          <w:rFonts w:ascii="Times New Roman" w:eastAsia="Times New Roman" w:hAnsi="Times New Roman" w:cs="Times New Roman"/>
+          <w:b/>
+          <w:bCs/>
+          <w:sz w:val="26"/>
+          <w:szCs w:val="26"/>
+          <w:highlight w:val="white"/>
+        </w:rPr>
+        <w:t>BD</w:t>
+      </w:r>
     </w:p>
     <w:sectPr>
       <w:pgSz w:w="11906" w:h="16838"/>

</xml_diff>

<commit_message>
New drive/form links, hover quotes on THE CORE, EB additions, Conference Manager roles, phone smoothness overhaul
Co-Authored-By: Claude Fable 5 <noreply@anthropic.com>
</commit_message>
<xml_diff>
--- a/STUFF/CORE SECRETRIAT AND EXECUTIVE BOARD.docx
+++ b/STUFF/CORE SECRETRIAT AND EXECUTIVE BOARD.docx
@@ -156,33 +156,19 @@
           <w:szCs w:val="26"/>
           <w:highlight w:val="white"/>
         </w:rPr>
-        <w:t>Ashvardh Dinesh - Head of Delegate Affairs</w:t>
-      </w:r>
-    </w:p>
-    <w:p>
-      <w:pPr>
-        <w:rPr>
-          <w:rFonts w:ascii="Times New Roman" w:eastAsia="Times New Roman" w:hAnsi="Times New Roman" w:cs="Times New Roman"/>
-          <w:b/>
-          <w:bCs/>
-          <w:sz w:val="26"/>
-          <w:szCs w:val="26"/>
-          <w:highlight w:val="white"/>
-        </w:rPr>
-      </w:pPr>
-      <w:proofErr w:type="spellStart"/>
-      <w:r>
-        <w:rPr>
-          <w:rFonts w:ascii="Times New Roman" w:eastAsia="Times New Roman" w:hAnsi="Times New Roman" w:cs="Times New Roman"/>
-          <w:b/>
-          <w:bCs/>
-          <w:sz w:val="26"/>
-          <w:szCs w:val="26"/>
-          <w:highlight w:val="white"/>
-        </w:rPr>
-        <w:t>Chaarika</w:t>
-      </w:r>
-      <w:proofErr w:type="spellEnd"/>
+        <w:t xml:space="preserve">Ashvardh Dinesh </w:t>
+      </w:r>
+      <w:r>
+        <w:rPr>
+          <w:rFonts w:ascii="Times New Roman" w:eastAsia="Times New Roman" w:hAnsi="Times New Roman" w:cs="Times New Roman"/>
+          <w:b/>
+          <w:bCs/>
+          <w:sz w:val="26"/>
+          <w:szCs w:val="26"/>
+          <w:highlight w:val="white"/>
+        </w:rPr>
+        <w:t>–</w:t>
+      </w:r>
       <w:r>
         <w:rPr>
           <w:rFonts w:ascii="Times New Roman" w:eastAsia="Times New Roman" w:hAnsi="Times New Roman" w:cs="Times New Roman"/>
@@ -203,6 +189,40 @@
           <w:szCs w:val="26"/>
           <w:highlight w:val="white"/>
         </w:rPr>
+        <w:t xml:space="preserve">Conference Manager </w:t>
+      </w:r>
+    </w:p>
+    <w:p>
+      <w:pPr>
+        <w:rPr>
+          <w:rFonts w:ascii="Times New Roman" w:eastAsia="Times New Roman" w:hAnsi="Times New Roman" w:cs="Times New Roman"/>
+          <w:b/>
+          <w:bCs/>
+          <w:sz w:val="26"/>
+          <w:szCs w:val="26"/>
+          <w:highlight w:val="white"/>
+        </w:rPr>
+      </w:pPr>
+      <w:r>
+        <w:rPr>
+          <w:rFonts w:ascii="Times New Roman" w:eastAsia="Times New Roman" w:hAnsi="Times New Roman" w:cs="Times New Roman"/>
+          <w:b/>
+          <w:bCs/>
+          <w:sz w:val="26"/>
+          <w:szCs w:val="26"/>
+          <w:highlight w:val="white"/>
+        </w:rPr>
+        <w:t xml:space="preserve">Chaarika </w:t>
+      </w:r>
+      <w:r>
+        <w:rPr>
+          <w:rFonts w:ascii="Times New Roman" w:eastAsia="Times New Roman" w:hAnsi="Times New Roman" w:cs="Times New Roman"/>
+          <w:b/>
+          <w:bCs/>
+          <w:sz w:val="26"/>
+          <w:szCs w:val="26"/>
+          <w:highlight w:val="white"/>
+        </w:rPr>
         <w:t>K</w:t>
       </w:r>
       <w:r>
@@ -214,43 +234,63 @@
           <w:szCs w:val="26"/>
           <w:highlight w:val="white"/>
         </w:rPr>
-        <w:t>umar - Head of Delegate Affairs</w:t>
-      </w:r>
-    </w:p>
-    <w:p>
-      <w:pPr>
-        <w:rPr>
-          <w:rFonts w:ascii="Times New Roman" w:eastAsia="Times New Roman" w:hAnsi="Times New Roman" w:cs="Times New Roman"/>
-          <w:b/>
-          <w:bCs/>
-          <w:sz w:val="26"/>
-          <w:szCs w:val="26"/>
-          <w:highlight w:val="white"/>
-        </w:rPr>
-      </w:pPr>
-      <w:proofErr w:type="spellStart"/>
-      <w:r>
-        <w:rPr>
-          <w:rFonts w:ascii="Times New Roman" w:eastAsia="Times New Roman" w:hAnsi="Times New Roman" w:cs="Times New Roman"/>
-          <w:b/>
-          <w:bCs/>
-          <w:sz w:val="26"/>
-          <w:szCs w:val="26"/>
-          <w:highlight w:val="white"/>
-        </w:rPr>
-        <w:t>Sisubaran</w:t>
-      </w:r>
-      <w:proofErr w:type="spellEnd"/>
-      <w:r>
-        <w:rPr>
-          <w:rFonts w:ascii="Times New Roman" w:eastAsia="Times New Roman" w:hAnsi="Times New Roman" w:cs="Times New Roman"/>
-          <w:b/>
-          <w:bCs/>
-          <w:sz w:val="26"/>
-          <w:szCs w:val="26"/>
-          <w:highlight w:val="white"/>
-        </w:rPr>
-        <w:t xml:space="preserve"> Moovendhan - Chief of Staff</w:t>
+        <w:t xml:space="preserve">umar </w:t>
+      </w:r>
+      <w:r>
+        <w:rPr>
+          <w:rFonts w:ascii="Times New Roman" w:eastAsia="Times New Roman" w:hAnsi="Times New Roman" w:cs="Times New Roman"/>
+          <w:b/>
+          <w:bCs/>
+          <w:sz w:val="26"/>
+          <w:szCs w:val="26"/>
+          <w:highlight w:val="white"/>
+        </w:rPr>
+        <w:t>–</w:t>
+      </w:r>
+      <w:r>
+        <w:rPr>
+          <w:rFonts w:ascii="Times New Roman" w:eastAsia="Times New Roman" w:hAnsi="Times New Roman" w:cs="Times New Roman"/>
+          <w:b/>
+          <w:bCs/>
+          <w:sz w:val="26"/>
+          <w:szCs w:val="26"/>
+          <w:highlight w:val="white"/>
+        </w:rPr>
+        <w:t xml:space="preserve"> </w:t>
+      </w:r>
+      <w:r>
+        <w:rPr>
+          <w:rFonts w:ascii="Times New Roman" w:eastAsia="Times New Roman" w:hAnsi="Times New Roman" w:cs="Times New Roman"/>
+          <w:b/>
+          <w:bCs/>
+          <w:sz w:val="26"/>
+          <w:szCs w:val="26"/>
+          <w:highlight w:val="white"/>
+        </w:rPr>
+        <w:t>Conference Manager</w:t>
+      </w:r>
+    </w:p>
+    <w:p>
+      <w:pPr>
+        <w:rPr>
+          <w:rFonts w:ascii="Times New Roman" w:eastAsia="Times New Roman" w:hAnsi="Times New Roman" w:cs="Times New Roman"/>
+          <w:b/>
+          <w:bCs/>
+          <w:sz w:val="26"/>
+          <w:szCs w:val="26"/>
+          <w:highlight w:val="white"/>
+        </w:rPr>
+      </w:pPr>
+      <w:r>
+        <w:rPr>
+          <w:rFonts w:ascii="Times New Roman" w:eastAsia="Times New Roman" w:hAnsi="Times New Roman" w:cs="Times New Roman"/>
+          <w:b/>
+          <w:bCs/>
+          <w:sz w:val="26"/>
+          <w:szCs w:val="26"/>
+          <w:highlight w:val="white"/>
+        </w:rPr>
+        <w:t>Sisubaran Moovendhan - Chief of Staff</w:t>
       </w:r>
     </w:p>
     <w:p>
@@ -296,31 +336,7 @@
           <w:szCs w:val="26"/>
           <w:highlight w:val="white"/>
         </w:rPr>
-        <w:t xml:space="preserve">Lohith </w:t>
-      </w:r>
-      <w:proofErr w:type="spellStart"/>
-      <w:r>
-        <w:rPr>
-          <w:rFonts w:ascii="Times New Roman" w:eastAsia="Times New Roman" w:hAnsi="Times New Roman" w:cs="Times New Roman"/>
-          <w:b/>
-          <w:bCs/>
-          <w:sz w:val="26"/>
-          <w:szCs w:val="26"/>
-          <w:highlight w:val="white"/>
-        </w:rPr>
-        <w:t>Tiruvuru</w:t>
-      </w:r>
-      <w:proofErr w:type="spellEnd"/>
-      <w:r>
-        <w:rPr>
-          <w:rFonts w:ascii="Times New Roman" w:eastAsia="Times New Roman" w:hAnsi="Times New Roman" w:cs="Times New Roman"/>
-          <w:b/>
-          <w:bCs/>
-          <w:sz w:val="26"/>
-          <w:szCs w:val="26"/>
-          <w:highlight w:val="white"/>
-        </w:rPr>
-        <w:t xml:space="preserve"> - Director of Photography</w:t>
+        <w:t>Lohith Tiruvuru - Director of Photography</w:t>
       </w:r>
     </w:p>
     <w:p>
@@ -378,31 +394,7 @@
           <w:szCs w:val="26"/>
           <w:highlight w:val="white"/>
         </w:rPr>
-        <w:t xml:space="preserve">Forum </w:t>
-      </w:r>
-      <w:proofErr w:type="spellStart"/>
-      <w:r>
-        <w:rPr>
-          <w:rFonts w:ascii="Times New Roman" w:eastAsia="Times New Roman" w:hAnsi="Times New Roman" w:cs="Times New Roman"/>
-          <w:b/>
-          <w:bCs/>
-          <w:sz w:val="26"/>
-          <w:szCs w:val="26"/>
-          <w:highlight w:val="white"/>
-        </w:rPr>
-        <w:t>Salutis</w:t>
-      </w:r>
-      <w:proofErr w:type="spellEnd"/>
-      <w:r>
-        <w:rPr>
-          <w:rFonts w:ascii="Times New Roman" w:eastAsia="Times New Roman" w:hAnsi="Times New Roman" w:cs="Times New Roman"/>
-          <w:b/>
-          <w:bCs/>
-          <w:sz w:val="26"/>
-          <w:szCs w:val="26"/>
-          <w:highlight w:val="white"/>
-        </w:rPr>
-        <w:t xml:space="preserve"> (Health)</w:t>
+        <w:t>Forum Salutis (Health)</w:t>
       </w:r>
     </w:p>
     <w:p>
@@ -449,29 +441,16 @@
           <w:highlight w:val="white"/>
         </w:rPr>
       </w:pPr>
-      <w:proofErr w:type="spellStart"/>
-      <w:r>
-        <w:rPr>
-          <w:rFonts w:ascii="Times New Roman" w:eastAsia="Times New Roman" w:hAnsi="Times New Roman" w:cs="Times New Roman"/>
-          <w:b/>
-          <w:bCs/>
-          <w:sz w:val="26"/>
-          <w:szCs w:val="26"/>
-          <w:highlight w:val="white"/>
-        </w:rPr>
-        <w:t>Lemula</w:t>
-      </w:r>
-      <w:proofErr w:type="spellEnd"/>
-      <w:r>
-        <w:rPr>
-          <w:rFonts w:ascii="Times New Roman" w:eastAsia="Times New Roman" w:hAnsi="Times New Roman" w:cs="Times New Roman"/>
-          <w:b/>
-          <w:bCs/>
-          <w:sz w:val="26"/>
-          <w:szCs w:val="26"/>
-          <w:highlight w:val="white"/>
-        </w:rPr>
-        <w:t xml:space="preserve"> Renita</w:t>
+      <w:r>
+        <w:rPr>
+          <w:rFonts w:ascii="Times New Roman" w:eastAsia="Times New Roman" w:hAnsi="Times New Roman" w:cs="Times New Roman"/>
+          <w:b/>
+          <w:bCs/>
+          <w:sz w:val="26"/>
+          <w:szCs w:val="26"/>
+          <w:highlight w:val="white"/>
+        </w:rPr>
+        <w:t>Lemula Renita</w:t>
       </w:r>
     </w:p>
     <w:p>
@@ -670,29 +649,16 @@
           <w:highlight w:val="white"/>
         </w:rPr>
       </w:pPr>
-      <w:proofErr w:type="spellStart"/>
-      <w:r>
-        <w:rPr>
-          <w:rFonts w:ascii="Times New Roman" w:eastAsia="Times New Roman" w:hAnsi="Times New Roman" w:cs="Times New Roman"/>
-          <w:b/>
-          <w:bCs/>
-          <w:sz w:val="26"/>
-          <w:szCs w:val="26"/>
-          <w:highlight w:val="white"/>
-        </w:rPr>
-        <w:t>Chaarika</w:t>
-      </w:r>
-      <w:proofErr w:type="spellEnd"/>
-      <w:r>
-        <w:rPr>
-          <w:rFonts w:ascii="Times New Roman" w:eastAsia="Times New Roman" w:hAnsi="Times New Roman" w:cs="Times New Roman"/>
-          <w:b/>
-          <w:bCs/>
-          <w:sz w:val="26"/>
-          <w:szCs w:val="26"/>
-          <w:highlight w:val="white"/>
-        </w:rPr>
-        <w:t xml:space="preserve"> </w:t>
+      <w:r>
+        <w:rPr>
+          <w:rFonts w:ascii="Times New Roman" w:eastAsia="Times New Roman" w:hAnsi="Times New Roman" w:cs="Times New Roman"/>
+          <w:b/>
+          <w:bCs/>
+          <w:sz w:val="26"/>
+          <w:szCs w:val="26"/>
+          <w:highlight w:val="white"/>
+        </w:rPr>
+        <w:t xml:space="preserve">Chaarika </w:t>
       </w:r>
       <w:r>
         <w:rPr>
@@ -786,29 +752,16 @@
           <w:highlight w:val="white"/>
         </w:rPr>
       </w:pPr>
-      <w:proofErr w:type="spellStart"/>
-      <w:r>
-        <w:rPr>
-          <w:rFonts w:ascii="Times New Roman" w:eastAsia="Times New Roman" w:hAnsi="Times New Roman" w:cs="Times New Roman"/>
-          <w:b/>
-          <w:bCs/>
-          <w:sz w:val="26"/>
-          <w:szCs w:val="26"/>
-          <w:highlight w:val="white"/>
-        </w:rPr>
-        <w:t>Sisubaran</w:t>
-      </w:r>
-      <w:proofErr w:type="spellEnd"/>
-      <w:r>
-        <w:rPr>
-          <w:rFonts w:ascii="Times New Roman" w:eastAsia="Times New Roman" w:hAnsi="Times New Roman" w:cs="Times New Roman"/>
-          <w:b/>
-          <w:bCs/>
-          <w:sz w:val="26"/>
-          <w:szCs w:val="26"/>
-          <w:highlight w:val="white"/>
-        </w:rPr>
-        <w:t xml:space="preserve"> Moovendhan</w:t>
+      <w:r>
+        <w:rPr>
+          <w:rFonts w:ascii="Times New Roman" w:eastAsia="Times New Roman" w:hAnsi="Times New Roman" w:cs="Times New Roman"/>
+          <w:b/>
+          <w:bCs/>
+          <w:sz w:val="26"/>
+          <w:szCs w:val="26"/>
+          <w:highlight w:val="white"/>
+        </w:rPr>
+        <w:t>Sisubaran Moovendhan</w:t>
       </w:r>
     </w:p>
     <w:p>
@@ -889,78 +842,30 @@
           <w:szCs w:val="26"/>
           <w:highlight w:val="white"/>
         </w:rPr>
-        <w:t xml:space="preserve">Forum </w:t>
-      </w:r>
-      <w:proofErr w:type="spellStart"/>
-      <w:r>
-        <w:rPr>
-          <w:rFonts w:ascii="Times New Roman" w:eastAsia="Times New Roman" w:hAnsi="Times New Roman" w:cs="Times New Roman"/>
-          <w:b/>
-          <w:bCs/>
-          <w:sz w:val="26"/>
-          <w:szCs w:val="26"/>
-          <w:highlight w:val="white"/>
-        </w:rPr>
-        <w:t>Athleticum</w:t>
-      </w:r>
-      <w:proofErr w:type="spellEnd"/>
-      <w:r>
-        <w:rPr>
-          <w:rFonts w:ascii="Times New Roman" w:eastAsia="Times New Roman" w:hAnsi="Times New Roman" w:cs="Times New Roman"/>
-          <w:b/>
-          <w:bCs/>
-          <w:sz w:val="26"/>
-          <w:szCs w:val="26"/>
-          <w:highlight w:val="white"/>
-        </w:rPr>
-        <w:t xml:space="preserve"> (Sports)</w:t>
-      </w:r>
-    </w:p>
-    <w:p>
-      <w:pPr>
-        <w:rPr>
-          <w:rFonts w:ascii="Times New Roman" w:eastAsia="Times New Roman" w:hAnsi="Times New Roman" w:cs="Times New Roman"/>
-          <w:b/>
-          <w:bCs/>
-          <w:sz w:val="26"/>
-          <w:szCs w:val="26"/>
-          <w:highlight w:val="white"/>
-        </w:rPr>
-      </w:pPr>
-      <w:r>
-        <w:rPr>
-          <w:rFonts w:ascii="Times New Roman" w:eastAsia="Times New Roman" w:hAnsi="Times New Roman" w:cs="Times New Roman"/>
-          <w:b/>
-          <w:bCs/>
-          <w:sz w:val="26"/>
-          <w:szCs w:val="26"/>
-          <w:highlight w:val="white"/>
-        </w:rPr>
-        <w:t xml:space="preserve">Lohith </w:t>
-      </w:r>
-      <w:proofErr w:type="spellStart"/>
-      <w:r>
-        <w:rPr>
-          <w:rFonts w:ascii="Times New Roman" w:eastAsia="Times New Roman" w:hAnsi="Times New Roman" w:cs="Times New Roman"/>
-          <w:b/>
-          <w:bCs/>
-          <w:sz w:val="26"/>
-          <w:szCs w:val="26"/>
-          <w:highlight w:val="white"/>
-        </w:rPr>
-        <w:t>Tiruvuru</w:t>
-      </w:r>
-      <w:proofErr w:type="spellEnd"/>
-      <w:r>
-        <w:rPr>
-          <w:rFonts w:ascii="Times New Roman" w:eastAsia="Times New Roman" w:hAnsi="Times New Roman" w:cs="Times New Roman"/>
-          <w:b/>
-          <w:bCs/>
-          <w:sz w:val="26"/>
-          <w:szCs w:val="26"/>
-          <w:highlight w:val="white"/>
-        </w:rPr>
-        <w:t xml:space="preserve"> </w:t>
+        <w:t>Forum Athleticum (Sports)</w:t>
+      </w:r>
+    </w:p>
+    <w:p>
+      <w:pPr>
+        <w:rPr>
+          <w:rFonts w:ascii="Times New Roman" w:eastAsia="Times New Roman" w:hAnsi="Times New Roman" w:cs="Times New Roman"/>
+          <w:b/>
+          <w:bCs/>
+          <w:sz w:val="26"/>
+          <w:szCs w:val="26"/>
+          <w:highlight w:val="white"/>
+        </w:rPr>
+      </w:pPr>
+      <w:r>
+        <w:rPr>
+          <w:rFonts w:ascii="Times New Roman" w:eastAsia="Times New Roman" w:hAnsi="Times New Roman" w:cs="Times New Roman"/>
+          <w:b/>
+          <w:bCs/>
+          <w:sz w:val="26"/>
+          <w:szCs w:val="26"/>
+          <w:highlight w:val="white"/>
+        </w:rPr>
+        <w:t xml:space="preserve">Lohith Tiruvuru </w:t>
       </w:r>
     </w:p>
     <w:p>
@@ -1053,53 +958,53 @@
           <w:szCs w:val="26"/>
           <w:highlight w:val="white"/>
         </w:rPr>
-        <w:t>Deva</w:t>
-      </w:r>
-    </w:p>
-    <w:p>
-      <w:pPr>
-        <w:rPr>
-          <w:rFonts w:ascii="Times New Roman" w:eastAsia="Times New Roman" w:hAnsi="Times New Roman" w:cs="Times New Roman"/>
-          <w:b/>
-          <w:bCs/>
-          <w:sz w:val="26"/>
-          <w:szCs w:val="26"/>
-          <w:highlight w:val="white"/>
-        </w:rPr>
-      </w:pPr>
-      <w:r>
-        <w:rPr>
-          <w:rFonts w:ascii="Times New Roman" w:eastAsia="Times New Roman" w:hAnsi="Times New Roman" w:cs="Times New Roman"/>
-          <w:b/>
-          <w:bCs/>
-          <w:sz w:val="26"/>
-          <w:szCs w:val="26"/>
-          <w:highlight w:val="white"/>
-        </w:rPr>
-        <w:t>TBD</w:t>
-      </w:r>
-    </w:p>
-    <w:p>
-      <w:pPr>
-        <w:rPr>
-          <w:rFonts w:ascii="Times New Roman" w:eastAsia="Times New Roman" w:hAnsi="Times New Roman" w:cs="Times New Roman"/>
-          <w:b/>
-          <w:bCs/>
-          <w:sz w:val="26"/>
-          <w:szCs w:val="26"/>
-          <w:highlight w:val="white"/>
-        </w:rPr>
-      </w:pPr>
-      <w:r>
-        <w:rPr>
-          <w:rFonts w:ascii="Times New Roman" w:eastAsia="Times New Roman" w:hAnsi="Times New Roman" w:cs="Times New Roman"/>
-          <w:b/>
-          <w:bCs/>
-          <w:sz w:val="26"/>
-          <w:szCs w:val="26"/>
-          <w:highlight w:val="white"/>
-        </w:rPr>
-        <w:t>TBD</w:t>
+        <w:t>Haasini K</w:t>
+      </w:r>
+    </w:p>
+    <w:p>
+      <w:pPr>
+        <w:rPr>
+          <w:rFonts w:ascii="Times New Roman" w:eastAsia="Times New Roman" w:hAnsi="Times New Roman" w:cs="Times New Roman"/>
+          <w:b/>
+          <w:bCs/>
+          <w:sz w:val="26"/>
+          <w:szCs w:val="26"/>
+          <w:highlight w:val="white"/>
+        </w:rPr>
+      </w:pPr>
+      <w:r>
+        <w:rPr>
+          <w:rFonts w:ascii="Times New Roman" w:eastAsia="Times New Roman" w:hAnsi="Times New Roman" w:cs="Times New Roman"/>
+          <w:b/>
+          <w:bCs/>
+          <w:sz w:val="26"/>
+          <w:szCs w:val="26"/>
+          <w:highlight w:val="white"/>
+        </w:rPr>
+        <w:t>Sudharshini</w:t>
+      </w:r>
+    </w:p>
+    <w:p>
+      <w:pPr>
+        <w:rPr>
+          <w:rFonts w:ascii="Times New Roman" w:eastAsia="Times New Roman" w:hAnsi="Times New Roman" w:cs="Times New Roman"/>
+          <w:b/>
+          <w:bCs/>
+          <w:sz w:val="26"/>
+          <w:szCs w:val="26"/>
+          <w:highlight w:val="white"/>
+        </w:rPr>
+      </w:pPr>
+      <w:r>
+        <w:rPr>
+          <w:rFonts w:ascii="Times New Roman" w:eastAsia="Times New Roman" w:hAnsi="Times New Roman" w:cs="Times New Roman"/>
+          <w:b/>
+          <w:bCs/>
+          <w:sz w:val="26"/>
+          <w:szCs w:val="26"/>
+          <w:highlight w:val="white"/>
+        </w:rPr>
+        <w:t>Raphael Wellington</w:t>
       </w:r>
     </w:p>
     <w:p>

</xml_diff>

<commit_message>
Gallery: GESMUN INTRA '25 photos with lightbox; Lemeula name fix; quote casing per doc
Co-Authored-By: Claude Fable 5 <noreply@anthropic.com>
</commit_message>
<xml_diff>
--- a/STUFF/CORE SECRETRIAT AND EXECUTIVE BOARD.docx
+++ b/STUFF/CORE SECRETRIAT AND EXECUTIVE BOARD.docx
@@ -450,7 +450,29 @@
           <w:szCs w:val="26"/>
           <w:highlight w:val="white"/>
         </w:rPr>
-        <w:t>Lemula Renita</w:t>
+        <w:t>Lem</w:t>
+      </w:r>
+      <w:r>
+        <w:rPr>
+          <w:rFonts w:ascii="Times New Roman" w:eastAsia="Times New Roman" w:hAnsi="Times New Roman" w:cs="Times New Roman"/>
+          <w:b/>
+          <w:bCs/>
+          <w:sz w:val="26"/>
+          <w:szCs w:val="26"/>
+          <w:highlight w:val="white"/>
+        </w:rPr>
+        <w:t>e</w:t>
+      </w:r>
+      <w:r>
+        <w:rPr>
+          <w:rFonts w:ascii="Times New Roman" w:eastAsia="Times New Roman" w:hAnsi="Times New Roman" w:cs="Times New Roman"/>
+          <w:b/>
+          <w:bCs/>
+          <w:sz w:val="26"/>
+          <w:szCs w:val="26"/>
+          <w:highlight w:val="white"/>
+        </w:rPr>
+        <w:t>ula Renita</w:t>
       </w:r>
     </w:p>
     <w:p>

</xml_diff>

<commit_message>
New organizer photos face-cropped and centred, role updates, auto-swiveling committee carousel
Co-Authored-By: Claude Fable 5 <noreply@anthropic.com>
</commit_message>
<xml_diff>
--- a/STUFF/CORE SECRETRIAT AND EXECUTIVE BOARD.docx
+++ b/STUFF/CORE SECRETRIAT AND EXECUTIVE BOARD.docx
@@ -110,7 +110,51 @@
           <w:szCs w:val="26"/>
           <w:highlight w:val="white"/>
         </w:rPr>
-        <w:t>Pushpak Natarajan - Chief Advisor</w:t>
+        <w:t xml:space="preserve">Pushpak Natarajan </w:t>
+      </w:r>
+      <w:r>
+        <w:rPr>
+          <w:rFonts w:ascii="Times New Roman" w:eastAsia="Times New Roman" w:hAnsi="Times New Roman" w:cs="Times New Roman"/>
+          <w:b/>
+          <w:bCs/>
+          <w:sz w:val="26"/>
+          <w:szCs w:val="26"/>
+          <w:highlight w:val="white"/>
+        </w:rPr>
+        <w:t>–</w:t>
+      </w:r>
+      <w:r>
+        <w:rPr>
+          <w:rFonts w:ascii="Times New Roman" w:eastAsia="Times New Roman" w:hAnsi="Times New Roman" w:cs="Times New Roman"/>
+          <w:b/>
+          <w:bCs/>
+          <w:sz w:val="26"/>
+          <w:szCs w:val="26"/>
+          <w:highlight w:val="white"/>
+        </w:rPr>
+        <w:t xml:space="preserve"> </w:t>
+      </w:r>
+      <w:r>
+        <w:rPr>
+          <w:rFonts w:ascii="Times New Roman" w:eastAsia="Times New Roman" w:hAnsi="Times New Roman" w:cs="Times New Roman"/>
+          <w:b/>
+          <w:bCs/>
+          <w:sz w:val="26"/>
+          <w:szCs w:val="26"/>
+          <w:highlight w:val="white"/>
+        </w:rPr>
+        <w:t xml:space="preserve">Deputy </w:t>
+      </w:r>
+      <w:r>
+        <w:rPr>
+          <w:rFonts w:ascii="Times New Roman" w:eastAsia="Times New Roman" w:hAnsi="Times New Roman" w:cs="Times New Roman"/>
+          <w:b/>
+          <w:bCs/>
+          <w:sz w:val="26"/>
+          <w:szCs w:val="26"/>
+          <w:highlight w:val="white"/>
+        </w:rPr>
+        <w:t>Secretary of Conference</w:t>
       </w:r>
     </w:p>
     <w:p>
@@ -290,7 +334,51 @@
           <w:szCs w:val="26"/>
           <w:highlight w:val="white"/>
         </w:rPr>
-        <w:t>Sisubaran Moovendhan - Chief of Staff</w:t>
+        <w:t xml:space="preserve">Sisubaran Moovendhan </w:t>
+      </w:r>
+      <w:r>
+        <w:rPr>
+          <w:rFonts w:ascii="Times New Roman" w:eastAsia="Times New Roman" w:hAnsi="Times New Roman" w:cs="Times New Roman"/>
+          <w:b/>
+          <w:bCs/>
+          <w:sz w:val="26"/>
+          <w:szCs w:val="26"/>
+          <w:highlight w:val="white"/>
+        </w:rPr>
+        <w:t>–</w:t>
+      </w:r>
+      <w:r>
+        <w:rPr>
+          <w:rFonts w:ascii="Times New Roman" w:eastAsia="Times New Roman" w:hAnsi="Times New Roman" w:cs="Times New Roman"/>
+          <w:b/>
+          <w:bCs/>
+          <w:sz w:val="26"/>
+          <w:szCs w:val="26"/>
+          <w:highlight w:val="white"/>
+        </w:rPr>
+        <w:t xml:space="preserve"> </w:t>
+      </w:r>
+      <w:r>
+        <w:rPr>
+          <w:rFonts w:ascii="Times New Roman" w:eastAsia="Times New Roman" w:hAnsi="Times New Roman" w:cs="Times New Roman"/>
+          <w:b/>
+          <w:bCs/>
+          <w:sz w:val="26"/>
+          <w:szCs w:val="26"/>
+          <w:highlight w:val="white"/>
+        </w:rPr>
+        <w:t xml:space="preserve">Deputy </w:t>
+      </w:r>
+      <w:r>
+        <w:rPr>
+          <w:rFonts w:ascii="Times New Roman" w:eastAsia="Times New Roman" w:hAnsi="Times New Roman" w:cs="Times New Roman"/>
+          <w:b/>
+          <w:bCs/>
+          <w:sz w:val="26"/>
+          <w:szCs w:val="26"/>
+          <w:highlight w:val="white"/>
+        </w:rPr>
+        <w:t>Executive Director</w:t>
       </w:r>
     </w:p>
     <w:p>

</xml_diff>

<commit_message>
Update all committee EB rosters, add 5th GESMUN INTRA '25 photo, add two mobile numbers ahead of landlines
Co-Authored-By: Claude Fable 5 <noreply@anthropic.com>
</commit_message>
<xml_diff>
--- a/STUFF/CORE SECRETRIAT AND EXECUTIVE BOARD.docx
+++ b/STUFF/CORE SECRETRIAT AND EXECUTIVE BOARD.docx
@@ -1,6 +1,6 @@
 
 <file path=word/document.xml><?xml version="1.0" encoding="utf-8"?>
-<w:document xmlns:wpc="http://schemas.microsoft.com/office/word/2010/wordprocessingCanvas" xmlns:cx="http://schemas.microsoft.com/office/drawing/2014/chartex" xmlns:cx1="http://schemas.microsoft.com/office/drawing/2015/9/8/chartex" xmlns:cx2="http://schemas.microsoft.com/office/drawing/2015/10/21/chartex" xmlns:cx3="http://schemas.microsoft.com/office/drawing/2016/5/9/chartex" xmlns:cx4="http://schemas.microsoft.com/office/drawing/2016/5/10/chartex" xmlns:cx5="http://schemas.microsoft.com/office/drawing/2016/5/11/chartex" xmlns:cx6="http://schemas.microsoft.com/office/drawing/2016/5/12/chartex" xmlns:cx7="http://schemas.microsoft.com/office/drawing/2016/5/13/chartex" xmlns:cx8="http://schemas.microsoft.com/office/drawing/2016/5/14/chartex" xmlns:mc="http://schemas.openxmlformats.org/markup-compatibility/2006" xmlns:aink="http://schemas.microsoft.com/office/drawing/2016/ink" xmlns:am3d="http://schemas.microsoft.com/office/drawing/2017/model3d" xmlns:o="urn:schemas-microsoft-com:office:office" xmlns:oel="http://schemas.microsoft.com/office/2019/extlst" xmlns:r="http://schemas.openxmlformats.org/officeDocument/2006/relationships" xmlns:m="http://schemas.openxmlformats.org/officeDocument/2006/math" xmlns:v="urn:schemas-microsoft-com:vml" xmlns:wp14="http://schemas.microsoft.com/office/word/2010/wordprocessingDrawing" xmlns:wp="http://schemas.openxmlformats.org/drawingml/2006/wordprocessingDrawing" xmlns:w10="urn:schemas-microsoft-com:office:word" xmlns:w="http://schemas.openxmlformats.org/wordprocessingml/2006/main" xmlns:w14="http://schemas.microsoft.com/office/word/2010/wordml" xmlns:w15="http://schemas.microsoft.com/office/word/2012/wordml" xmlns:w16cex="http://schemas.microsoft.com/office/word/2018/wordml/cex" xmlns:w16cid="http://schemas.microsoft.com/office/word/2016/wordml/cid" xmlns:w16="http://schemas.microsoft.com/office/word/2018/wordml" xmlns:w16du="http://schemas.microsoft.com/office/word/2023/wordml/word16du" xmlns:w16sdtdh="http://schemas.microsoft.com/office/word/2020/wordml/sdtdatahash" xmlns:w16sdtfl="http://schemas.microsoft.com/office/word/2024/wordml/sdtformatlock" xmlns:w16se="http://schemas.microsoft.com/office/word/2015/wordml/symex" xmlns:wpg="http://schemas.microsoft.com/office/word/2010/wordprocessingGroup" xmlns:wpi="http://schemas.microsoft.com/office/word/2010/wordprocessingInk" xmlns:wne="http://schemas.microsoft.com/office/word/2006/wordml" xmlns:wps="http://schemas.microsoft.com/office/word/2010/wordprocessingShape" mc:Ignorable="w14 w15 w16se w16cid w16 w16cex w16sdtdh w16sdtfl w16du wp14">
+<w:document xmlns:wpc="http://schemas.microsoft.com/office/word/2010/wordprocessingCanvas" xmlns:cx="http://schemas.microsoft.com/office/drawing/2014/chartex" xmlns:cx1="http://schemas.microsoft.com/office/drawing/2015/9/8/chartex" xmlns:cx2="http://schemas.microsoft.com/office/drawing/2015/10/21/chartex" xmlns:cx3="http://schemas.microsoft.com/office/drawing/2016/5/9/chartex" xmlns:cx4="http://schemas.microsoft.com/office/drawing/2016/5/10/chartex" xmlns:cx5="http://schemas.microsoft.com/office/drawing/2016/5/11/chartex" xmlns:cx6="http://schemas.microsoft.com/office/drawing/2016/5/12/chartex" xmlns:cx7="http://schemas.microsoft.com/office/drawing/2016/5/13/chartex" xmlns:cx8="http://schemas.microsoft.com/office/drawing/2016/5/14/chartex" xmlns:mc="http://schemas.openxmlformats.org/markup-compatibility/2006" xmlns:aink="http://schemas.microsoft.com/office/drawing/2016/ink" xmlns:am3d="http://schemas.microsoft.com/office/drawing/2017/model3d" xmlns:o="urn:schemas-microsoft-com:office:office" xmlns:oel="http://schemas.microsoft.com/office/2019/extlst" xmlns:r="http://schemas.openxmlformats.org/officeDocument/2006/relationships" xmlns:m="http://schemas.openxmlformats.org/officeDocument/2006/math" xmlns:v="urn:schemas-microsoft-com:vml" xmlns:wp14="http://schemas.microsoft.com/office/word/2010/wordprocessingDrawing" xmlns:wp="http://schemas.openxmlformats.org/drawingml/2006/wordprocessingDrawing" xmlns:w10="urn:schemas-microsoft-com:office:word" xmlns:w="http://schemas.openxmlformats.org/wordprocessingml/2006/main" xmlns:w14="http://schemas.microsoft.com/office/word/2010/wordml" xmlns:w15="http://schemas.microsoft.com/office/word/2012/wordml" xmlns:w16cei="http://schemas.microsoft.com/office/word/2026/wordml/cei" xmlns:w16cex="http://schemas.microsoft.com/office/word/2018/wordml/cex" xmlns:w16cid="http://schemas.microsoft.com/office/word/2016/wordml/cid" xmlns:w16="http://schemas.microsoft.com/office/word/2018/wordml" xmlns:w16du="http://schemas.microsoft.com/office/word/2023/wordml/word16du" xmlns:w16sdtdh="http://schemas.microsoft.com/office/word/2020/wordml/sdtdatahash" xmlns:w16sdtfl="http://schemas.microsoft.com/office/word/2024/wordml/sdtformatlock" xmlns:w16se="http://schemas.microsoft.com/office/word/2015/wordml/symex" xmlns:wpg="http://schemas.microsoft.com/office/word/2010/wordprocessingGroup" xmlns:wpi="http://schemas.microsoft.com/office/word/2010/wordprocessingInk" xmlns:wne="http://schemas.microsoft.com/office/word/2006/wordml" xmlns:wps="http://schemas.microsoft.com/office/word/2010/wordprocessingShape" mc:Ignorable="w14 w15 w16se w16cid w16 w16cex w16sdtdh w16sdtfl w16du wp14">
   <w:background w:color="FFFFFF"/>
   <w:body>
     <w:p>
@@ -143,18 +143,7 @@
           <w:szCs w:val="26"/>
           <w:highlight w:val="white"/>
         </w:rPr>
-        <w:t xml:space="preserve">Deputy </w:t>
-      </w:r>
-      <w:r>
-        <w:rPr>
-          <w:rFonts w:ascii="Times New Roman" w:eastAsia="Times New Roman" w:hAnsi="Times New Roman" w:cs="Times New Roman"/>
-          <w:b/>
-          <w:bCs/>
-          <w:sz w:val="26"/>
-          <w:szCs w:val="26"/>
-          <w:highlight w:val="white"/>
-        </w:rPr>
-        <w:t>Secretary of Conference</w:t>
+        <w:t>Deputy Secretary of Conference</w:t>
       </w:r>
     </w:p>
     <w:p>
@@ -247,16 +236,29 @@
           <w:highlight w:val="white"/>
         </w:rPr>
       </w:pPr>
-      <w:r>
-        <w:rPr>
-          <w:rFonts w:ascii="Times New Roman" w:eastAsia="Times New Roman" w:hAnsi="Times New Roman" w:cs="Times New Roman"/>
-          <w:b/>
-          <w:bCs/>
-          <w:sz w:val="26"/>
-          <w:szCs w:val="26"/>
-          <w:highlight w:val="white"/>
-        </w:rPr>
-        <w:t xml:space="preserve">Chaarika </w:t>
+      <w:proofErr w:type="spellStart"/>
+      <w:r>
+        <w:rPr>
+          <w:rFonts w:ascii="Times New Roman" w:eastAsia="Times New Roman" w:hAnsi="Times New Roman" w:cs="Times New Roman"/>
+          <w:b/>
+          <w:bCs/>
+          <w:sz w:val="26"/>
+          <w:szCs w:val="26"/>
+          <w:highlight w:val="white"/>
+        </w:rPr>
+        <w:t>Chaarika</w:t>
+      </w:r>
+      <w:proofErr w:type="spellEnd"/>
+      <w:r>
+        <w:rPr>
+          <w:rFonts w:ascii="Times New Roman" w:eastAsia="Times New Roman" w:hAnsi="Times New Roman" w:cs="Times New Roman"/>
+          <w:b/>
+          <w:bCs/>
+          <w:sz w:val="26"/>
+          <w:szCs w:val="26"/>
+          <w:highlight w:val="white"/>
+        </w:rPr>
+        <w:t xml:space="preserve"> </w:t>
       </w:r>
       <w:r>
         <w:rPr>
@@ -325,16 +327,29 @@
           <w:highlight w:val="white"/>
         </w:rPr>
       </w:pPr>
-      <w:r>
-        <w:rPr>
-          <w:rFonts w:ascii="Times New Roman" w:eastAsia="Times New Roman" w:hAnsi="Times New Roman" w:cs="Times New Roman"/>
-          <w:b/>
-          <w:bCs/>
-          <w:sz w:val="26"/>
-          <w:szCs w:val="26"/>
-          <w:highlight w:val="white"/>
-        </w:rPr>
-        <w:t xml:space="preserve">Sisubaran Moovendhan </w:t>
+      <w:proofErr w:type="spellStart"/>
+      <w:r>
+        <w:rPr>
+          <w:rFonts w:ascii="Times New Roman" w:eastAsia="Times New Roman" w:hAnsi="Times New Roman" w:cs="Times New Roman"/>
+          <w:b/>
+          <w:bCs/>
+          <w:sz w:val="26"/>
+          <w:szCs w:val="26"/>
+          <w:highlight w:val="white"/>
+        </w:rPr>
+        <w:t>Sisubaran</w:t>
+      </w:r>
+      <w:proofErr w:type="spellEnd"/>
+      <w:r>
+        <w:rPr>
+          <w:rFonts w:ascii="Times New Roman" w:eastAsia="Times New Roman" w:hAnsi="Times New Roman" w:cs="Times New Roman"/>
+          <w:b/>
+          <w:bCs/>
+          <w:sz w:val="26"/>
+          <w:szCs w:val="26"/>
+          <w:highlight w:val="white"/>
+        </w:rPr>
+        <w:t xml:space="preserve"> Moovendhan </w:t>
       </w:r>
       <w:r>
         <w:rPr>
@@ -367,18 +382,7 @@
           <w:szCs w:val="26"/>
           <w:highlight w:val="white"/>
         </w:rPr>
-        <w:t xml:space="preserve">Deputy </w:t>
-      </w:r>
-      <w:r>
-        <w:rPr>
-          <w:rFonts w:ascii="Times New Roman" w:eastAsia="Times New Roman" w:hAnsi="Times New Roman" w:cs="Times New Roman"/>
-          <w:b/>
-          <w:bCs/>
-          <w:sz w:val="26"/>
-          <w:szCs w:val="26"/>
-          <w:highlight w:val="white"/>
-        </w:rPr>
-        <w:t>Executive Director</w:t>
+        <w:t>Deputy Executive Director</w:t>
       </w:r>
     </w:p>
     <w:p>
@@ -424,7 +428,31 @@
           <w:szCs w:val="26"/>
           <w:highlight w:val="white"/>
         </w:rPr>
-        <w:t>Lohith Tiruvuru - Director of Photography</w:t>
+        <w:t xml:space="preserve">Lohith </w:t>
+      </w:r>
+      <w:proofErr w:type="spellStart"/>
+      <w:r>
+        <w:rPr>
+          <w:rFonts w:ascii="Times New Roman" w:eastAsia="Times New Roman" w:hAnsi="Times New Roman" w:cs="Times New Roman"/>
+          <w:b/>
+          <w:bCs/>
+          <w:sz w:val="26"/>
+          <w:szCs w:val="26"/>
+          <w:highlight w:val="white"/>
+        </w:rPr>
+        <w:t>Tiruvuru</w:t>
+      </w:r>
+      <w:proofErr w:type="spellEnd"/>
+      <w:r>
+        <w:rPr>
+          <w:rFonts w:ascii="Times New Roman" w:eastAsia="Times New Roman" w:hAnsi="Times New Roman" w:cs="Times New Roman"/>
+          <w:b/>
+          <w:bCs/>
+          <w:sz w:val="26"/>
+          <w:szCs w:val="26"/>
+          <w:highlight w:val="white"/>
+        </w:rPr>
+        <w:t xml:space="preserve"> - Director of Photography</w:t>
       </w:r>
     </w:p>
     <w:p>
@@ -473,16 +501,52 @@
           <w:highlight w:val="white"/>
         </w:rPr>
       </w:pPr>
-      <w:r>
-        <w:rPr>
-          <w:rFonts w:ascii="Times New Roman" w:eastAsia="Times New Roman" w:hAnsi="Times New Roman" w:cs="Times New Roman"/>
-          <w:b/>
-          <w:bCs/>
-          <w:sz w:val="26"/>
-          <w:szCs w:val="26"/>
-          <w:highlight w:val="white"/>
-        </w:rPr>
-        <w:t>Forum Salutis (Health)</w:t>
+    </w:p>
+    <w:p>
+      <w:pPr>
+        <w:rPr>
+          <w:rFonts w:ascii="Times New Roman" w:eastAsia="Times New Roman" w:hAnsi="Times New Roman" w:cs="Times New Roman"/>
+          <w:b/>
+          <w:bCs/>
+          <w:sz w:val="26"/>
+          <w:szCs w:val="26"/>
+          <w:highlight w:val="white"/>
+        </w:rPr>
+      </w:pPr>
+      <w:r>
+        <w:rPr>
+          <w:rFonts w:ascii="Times New Roman" w:eastAsia="Times New Roman" w:hAnsi="Times New Roman" w:cs="Times New Roman"/>
+          <w:b/>
+          <w:bCs/>
+          <w:sz w:val="26"/>
+          <w:szCs w:val="26"/>
+          <w:highlight w:val="white"/>
+        </w:rPr>
+        <w:t xml:space="preserve">Forum </w:t>
+      </w:r>
+      <w:proofErr w:type="spellStart"/>
+      <w:r>
+        <w:rPr>
+          <w:rFonts w:ascii="Times New Roman" w:eastAsia="Times New Roman" w:hAnsi="Times New Roman" w:cs="Times New Roman"/>
+          <w:b/>
+          <w:bCs/>
+          <w:sz w:val="26"/>
+          <w:szCs w:val="26"/>
+          <w:highlight w:val="white"/>
+        </w:rPr>
+        <w:t>Salutis</w:t>
+      </w:r>
+      <w:proofErr w:type="spellEnd"/>
+      <w:r>
+        <w:rPr>
+          <w:rFonts w:ascii="Times New Roman" w:eastAsia="Times New Roman" w:hAnsi="Times New Roman" w:cs="Times New Roman"/>
+          <w:b/>
+          <w:bCs/>
+          <w:sz w:val="26"/>
+          <w:szCs w:val="26"/>
+          <w:highlight w:val="white"/>
+        </w:rPr>
+        <w:t xml:space="preserve"> (Health)</w:t>
       </w:r>
     </w:p>
     <w:p>
@@ -538,52 +602,7 @@
           <w:szCs w:val="26"/>
           <w:highlight w:val="white"/>
         </w:rPr>
-        <w:t>Lem</w:t>
-      </w:r>
-      <w:r>
-        <w:rPr>
-          <w:rFonts w:ascii="Times New Roman" w:eastAsia="Times New Roman" w:hAnsi="Times New Roman" w:cs="Times New Roman"/>
-          <w:b/>
-          <w:bCs/>
-          <w:sz w:val="26"/>
-          <w:szCs w:val="26"/>
-          <w:highlight w:val="white"/>
-        </w:rPr>
-        <w:t>e</w:t>
-      </w:r>
-      <w:r>
-        <w:rPr>
-          <w:rFonts w:ascii="Times New Roman" w:eastAsia="Times New Roman" w:hAnsi="Times New Roman" w:cs="Times New Roman"/>
-          <w:b/>
-          <w:bCs/>
-          <w:sz w:val="26"/>
-          <w:szCs w:val="26"/>
-          <w:highlight w:val="white"/>
-        </w:rPr>
-        <w:t>ula Renita</w:t>
-      </w:r>
-    </w:p>
-    <w:p>
-      <w:pPr>
-        <w:rPr>
-          <w:rFonts w:ascii="Times New Roman" w:eastAsia="Times New Roman" w:hAnsi="Times New Roman" w:cs="Times New Roman"/>
-          <w:b/>
-          <w:bCs/>
-          <w:sz w:val="26"/>
-          <w:szCs w:val="26"/>
-          <w:highlight w:val="white"/>
-        </w:rPr>
-      </w:pPr>
-      <w:r>
-        <w:rPr>
-          <w:rFonts w:ascii="Times New Roman" w:eastAsia="Times New Roman" w:hAnsi="Times New Roman" w:cs="Times New Roman"/>
-          <w:b/>
-          <w:bCs/>
-          <w:sz w:val="26"/>
-          <w:szCs w:val="26"/>
-          <w:highlight w:val="white"/>
-        </w:rPr>
-        <w:t>TBD</w:t>
+        <w:t xml:space="preserve">Sudharshini </w:t>
       </w:r>
     </w:p>
     <w:p>
@@ -678,29 +697,6 @@
           <w:highlight w:val="white"/>
         </w:rPr>
       </w:pPr>
-      <w:r>
-        <w:rPr>
-          <w:rFonts w:ascii="Times New Roman" w:eastAsia="Times New Roman" w:hAnsi="Times New Roman" w:cs="Times New Roman"/>
-          <w:b/>
-          <w:bCs/>
-          <w:sz w:val="26"/>
-          <w:szCs w:val="26"/>
-          <w:highlight w:val="white"/>
-        </w:rPr>
-        <w:t>TBD</w:t>
-      </w:r>
-    </w:p>
-    <w:p>
-      <w:pPr>
-        <w:rPr>
-          <w:rFonts w:ascii="Times New Roman" w:eastAsia="Times New Roman" w:hAnsi="Times New Roman" w:cs="Times New Roman"/>
-          <w:b/>
-          <w:bCs/>
-          <w:sz w:val="26"/>
-          <w:szCs w:val="26"/>
-          <w:highlight w:val="white"/>
-        </w:rPr>
-      </w:pPr>
     </w:p>
     <w:p>
       <w:pPr>
@@ -759,16 +755,29 @@
           <w:highlight w:val="white"/>
         </w:rPr>
       </w:pPr>
-      <w:r>
-        <w:rPr>
-          <w:rFonts w:ascii="Times New Roman" w:eastAsia="Times New Roman" w:hAnsi="Times New Roman" w:cs="Times New Roman"/>
-          <w:b/>
-          <w:bCs/>
-          <w:sz w:val="26"/>
-          <w:szCs w:val="26"/>
-          <w:highlight w:val="white"/>
-        </w:rPr>
-        <w:t xml:space="preserve">Chaarika </w:t>
+      <w:proofErr w:type="spellStart"/>
+      <w:r>
+        <w:rPr>
+          <w:rFonts w:ascii="Times New Roman" w:eastAsia="Times New Roman" w:hAnsi="Times New Roman" w:cs="Times New Roman"/>
+          <w:b/>
+          <w:bCs/>
+          <w:sz w:val="26"/>
+          <w:szCs w:val="26"/>
+          <w:highlight w:val="white"/>
+        </w:rPr>
+        <w:t>Chaarika</w:t>
+      </w:r>
+      <w:proofErr w:type="spellEnd"/>
+      <w:r>
+        <w:rPr>
+          <w:rFonts w:ascii="Times New Roman" w:eastAsia="Times New Roman" w:hAnsi="Times New Roman" w:cs="Times New Roman"/>
+          <w:b/>
+          <w:bCs/>
+          <w:sz w:val="26"/>
+          <w:szCs w:val="26"/>
+          <w:highlight w:val="white"/>
+        </w:rPr>
+        <w:t xml:space="preserve"> </w:t>
       </w:r>
       <w:r>
         <w:rPr>
@@ -813,7 +822,7 @@
           <w:szCs w:val="26"/>
           <w:highlight w:val="white"/>
         </w:rPr>
-        <w:t>TBD</w:t>
+        <w:t>Zaha Ahmed</w:t>
       </w:r>
     </w:p>
     <w:p>
@@ -862,16 +871,29 @@
           <w:highlight w:val="white"/>
         </w:rPr>
       </w:pPr>
-      <w:r>
-        <w:rPr>
-          <w:rFonts w:ascii="Times New Roman" w:eastAsia="Times New Roman" w:hAnsi="Times New Roman" w:cs="Times New Roman"/>
-          <w:b/>
-          <w:bCs/>
-          <w:sz w:val="26"/>
-          <w:szCs w:val="26"/>
-          <w:highlight w:val="white"/>
-        </w:rPr>
-        <w:t>Sisubaran Moovendhan</w:t>
+      <w:proofErr w:type="spellStart"/>
+      <w:r>
+        <w:rPr>
+          <w:rFonts w:ascii="Times New Roman" w:eastAsia="Times New Roman" w:hAnsi="Times New Roman" w:cs="Times New Roman"/>
+          <w:b/>
+          <w:bCs/>
+          <w:sz w:val="26"/>
+          <w:szCs w:val="26"/>
+          <w:highlight w:val="white"/>
+        </w:rPr>
+        <w:t>Sisubaran</w:t>
+      </w:r>
+      <w:proofErr w:type="spellEnd"/>
+      <w:r>
+        <w:rPr>
+          <w:rFonts w:ascii="Times New Roman" w:eastAsia="Times New Roman" w:hAnsi="Times New Roman" w:cs="Times New Roman"/>
+          <w:b/>
+          <w:bCs/>
+          <w:sz w:val="26"/>
+          <w:szCs w:val="26"/>
+          <w:highlight w:val="white"/>
+        </w:rPr>
+        <w:t xml:space="preserve"> Moovendhan</w:t>
       </w:r>
     </w:p>
     <w:p>
@@ -908,74 +930,99 @@
           <w:highlight w:val="white"/>
         </w:rPr>
       </w:pPr>
-      <w:r>
-        <w:rPr>
-          <w:rFonts w:ascii="Times New Roman" w:eastAsia="Times New Roman" w:hAnsi="Times New Roman" w:cs="Times New Roman"/>
-          <w:b/>
-          <w:bCs/>
-          <w:sz w:val="26"/>
-          <w:szCs w:val="26"/>
-          <w:highlight w:val="white"/>
-        </w:rPr>
-        <w:t>TBD</w:t>
-      </w:r>
-    </w:p>
-    <w:p>
-      <w:pPr>
-        <w:rPr>
-          <w:rFonts w:ascii="Times New Roman" w:eastAsia="Times New Roman" w:hAnsi="Times New Roman" w:cs="Times New Roman"/>
-          <w:b/>
-          <w:bCs/>
-          <w:sz w:val="26"/>
-          <w:szCs w:val="26"/>
-          <w:highlight w:val="white"/>
-        </w:rPr>
-      </w:pPr>
-    </w:p>
-    <w:p>
-      <w:pPr>
-        <w:rPr>
-          <w:rFonts w:ascii="Times New Roman" w:eastAsia="Times New Roman" w:hAnsi="Times New Roman" w:cs="Times New Roman"/>
-          <w:b/>
-          <w:bCs/>
-          <w:sz w:val="26"/>
-          <w:szCs w:val="26"/>
-          <w:highlight w:val="white"/>
-        </w:rPr>
-      </w:pPr>
-      <w:r>
-        <w:rPr>
-          <w:rFonts w:ascii="Times New Roman" w:eastAsia="Times New Roman" w:hAnsi="Times New Roman" w:cs="Times New Roman"/>
-          <w:b/>
-          <w:bCs/>
-          <w:sz w:val="26"/>
-          <w:szCs w:val="26"/>
-          <w:highlight w:val="white"/>
-        </w:rPr>
-        <w:t>Forum Athleticum (Sports)</w:t>
-      </w:r>
-    </w:p>
-    <w:p>
-      <w:pPr>
-        <w:rPr>
-          <w:rFonts w:ascii="Times New Roman" w:eastAsia="Times New Roman" w:hAnsi="Times New Roman" w:cs="Times New Roman"/>
-          <w:b/>
-          <w:bCs/>
-          <w:sz w:val="26"/>
-          <w:szCs w:val="26"/>
-          <w:highlight w:val="white"/>
-        </w:rPr>
-      </w:pPr>
-      <w:r>
-        <w:rPr>
-          <w:rFonts w:ascii="Times New Roman" w:eastAsia="Times New Roman" w:hAnsi="Times New Roman" w:cs="Times New Roman"/>
-          <w:b/>
-          <w:bCs/>
-          <w:sz w:val="26"/>
-          <w:szCs w:val="26"/>
-          <w:highlight w:val="white"/>
-        </w:rPr>
-        <w:t xml:space="preserve">Lohith Tiruvuru </w:t>
+    </w:p>
+    <w:p>
+      <w:pPr>
+        <w:rPr>
+          <w:rFonts w:ascii="Times New Roman" w:eastAsia="Times New Roman" w:hAnsi="Times New Roman" w:cs="Times New Roman"/>
+          <w:b/>
+          <w:bCs/>
+          <w:sz w:val="26"/>
+          <w:szCs w:val="26"/>
+          <w:highlight w:val="white"/>
+        </w:rPr>
+      </w:pPr>
+      <w:r>
+        <w:rPr>
+          <w:rFonts w:ascii="Times New Roman" w:eastAsia="Times New Roman" w:hAnsi="Times New Roman" w:cs="Times New Roman"/>
+          <w:b/>
+          <w:bCs/>
+          <w:sz w:val="26"/>
+          <w:szCs w:val="26"/>
+          <w:highlight w:val="white"/>
+        </w:rPr>
+        <w:t xml:space="preserve">Forum </w:t>
+      </w:r>
+      <w:proofErr w:type="spellStart"/>
+      <w:r>
+        <w:rPr>
+          <w:rFonts w:ascii="Times New Roman" w:eastAsia="Times New Roman" w:hAnsi="Times New Roman" w:cs="Times New Roman"/>
+          <w:b/>
+          <w:bCs/>
+          <w:sz w:val="26"/>
+          <w:szCs w:val="26"/>
+          <w:highlight w:val="white"/>
+        </w:rPr>
+        <w:t>Athleticum</w:t>
+      </w:r>
+      <w:proofErr w:type="spellEnd"/>
+      <w:r>
+        <w:rPr>
+          <w:rFonts w:ascii="Times New Roman" w:eastAsia="Times New Roman" w:hAnsi="Times New Roman" w:cs="Times New Roman"/>
+          <w:b/>
+          <w:bCs/>
+          <w:sz w:val="26"/>
+          <w:szCs w:val="26"/>
+          <w:highlight w:val="white"/>
+        </w:rPr>
+        <w:t xml:space="preserve"> (Sports)</w:t>
+      </w:r>
+    </w:p>
+    <w:p>
+      <w:pPr>
+        <w:rPr>
+          <w:rFonts w:ascii="Times New Roman" w:eastAsia="Times New Roman" w:hAnsi="Times New Roman" w:cs="Times New Roman"/>
+          <w:b/>
+          <w:bCs/>
+          <w:sz w:val="26"/>
+          <w:szCs w:val="26"/>
+          <w:highlight w:val="white"/>
+        </w:rPr>
+      </w:pPr>
+      <w:r>
+        <w:rPr>
+          <w:rFonts w:ascii="Times New Roman" w:eastAsia="Times New Roman" w:hAnsi="Times New Roman" w:cs="Times New Roman"/>
+          <w:b/>
+          <w:bCs/>
+          <w:sz w:val="26"/>
+          <w:szCs w:val="26"/>
+          <w:highlight w:val="white"/>
+        </w:rPr>
+        <w:t xml:space="preserve">Lohith </w:t>
+      </w:r>
+      <w:proofErr w:type="spellStart"/>
+      <w:r>
+        <w:rPr>
+          <w:rFonts w:ascii="Times New Roman" w:eastAsia="Times New Roman" w:hAnsi="Times New Roman" w:cs="Times New Roman"/>
+          <w:b/>
+          <w:bCs/>
+          <w:sz w:val="26"/>
+          <w:szCs w:val="26"/>
+          <w:highlight w:val="white"/>
+        </w:rPr>
+        <w:t>Tiruvuru</w:t>
+      </w:r>
+      <w:proofErr w:type="spellEnd"/>
+      <w:r>
+        <w:rPr>
+          <w:rFonts w:ascii="Times New Roman" w:eastAsia="Times New Roman" w:hAnsi="Times New Roman" w:cs="Times New Roman"/>
+          <w:b/>
+          <w:bCs/>
+          <w:sz w:val="26"/>
+          <w:szCs w:val="26"/>
+          <w:highlight w:val="white"/>
+        </w:rPr>
+        <w:t xml:space="preserve"> </w:t>
       </w:r>
     </w:p>
     <w:p>
@@ -1021,7 +1068,7 @@
           <w:szCs w:val="26"/>
           <w:highlight w:val="white"/>
         </w:rPr>
-        <w:t>TBD</w:t>
+        <w:t>Abhinand AU</w:t>
       </w:r>
     </w:p>
     <w:p>
@@ -1115,40 +1162,6 @@
           <w:highlight w:val="white"/>
         </w:rPr>
         <w:t>Raphael Wellington</w:t>
-      </w:r>
-    </w:p>
-    <w:p>
-      <w:pPr>
-        <w:rPr>
-          <w:rFonts w:ascii="Times New Roman" w:eastAsia="Times New Roman" w:hAnsi="Times New Roman" w:cs="Times New Roman"/>
-          <w:b/>
-          <w:bCs/>
-          <w:sz w:val="26"/>
-          <w:szCs w:val="26"/>
-          <w:highlight w:val="white"/>
-        </w:rPr>
-      </w:pPr>
-      <w:r>
-        <w:rPr>
-          <w:rFonts w:ascii="Times New Roman" w:eastAsia="Times New Roman" w:hAnsi="Times New Roman" w:cs="Times New Roman"/>
-          <w:b/>
-          <w:bCs/>
-          <w:sz w:val="26"/>
-          <w:szCs w:val="26"/>
-          <w:highlight w:val="white"/>
-        </w:rPr>
-        <w:t>T</w:t>
-      </w:r>
-      <w:r>
-        <w:rPr>
-          <w:rFonts w:ascii="Times New Roman" w:eastAsia="Times New Roman" w:hAnsi="Times New Roman" w:cs="Times New Roman"/>
-          <w:b/>
-          <w:bCs/>
-          <w:sz w:val="26"/>
-          <w:szCs w:val="26"/>
-          <w:highlight w:val="white"/>
-        </w:rPr>
-        <w:t>BD</w:t>
       </w:r>
     </w:p>
     <w:sectPr>

</xml_diff>

<commit_message>
Swap Sudharshini for Devamilanie on Forum Veritas EB
Co-Authored-By: Claude Fable 5 <noreply@anthropic.com>
</commit_message>
<xml_diff>
--- a/STUFF/CORE SECRETRIAT AND EXECUTIVE BOARD.docx
+++ b/STUFF/CORE SECRETRIAT AND EXECUTIVE BOARD.docx
@@ -236,19 +236,50 @@
           <w:highlight w:val="white"/>
         </w:rPr>
       </w:pPr>
-      <w:proofErr w:type="spellStart"/>
-      <w:r>
-        <w:rPr>
-          <w:rFonts w:ascii="Times New Roman" w:eastAsia="Times New Roman" w:hAnsi="Times New Roman" w:cs="Times New Roman"/>
-          <w:b/>
-          <w:bCs/>
-          <w:sz w:val="26"/>
-          <w:szCs w:val="26"/>
-          <w:highlight w:val="white"/>
-        </w:rPr>
-        <w:t>Chaarika</w:t>
-      </w:r>
-      <w:proofErr w:type="spellEnd"/>
+      <w:r>
+        <w:rPr>
+          <w:rFonts w:ascii="Times New Roman" w:eastAsia="Times New Roman" w:hAnsi="Times New Roman" w:cs="Times New Roman"/>
+          <w:b/>
+          <w:bCs/>
+          <w:sz w:val="26"/>
+          <w:szCs w:val="26"/>
+          <w:highlight w:val="white"/>
+        </w:rPr>
+        <w:t xml:space="preserve">Chaarika </w:t>
+      </w:r>
+      <w:r>
+        <w:rPr>
+          <w:rFonts w:ascii="Times New Roman" w:eastAsia="Times New Roman" w:hAnsi="Times New Roman" w:cs="Times New Roman"/>
+          <w:b/>
+          <w:bCs/>
+          <w:sz w:val="26"/>
+          <w:szCs w:val="26"/>
+          <w:highlight w:val="white"/>
+        </w:rPr>
+        <w:t>K</w:t>
+      </w:r>
+      <w:r>
+        <w:rPr>
+          <w:rFonts w:ascii="Times New Roman" w:eastAsia="Times New Roman" w:hAnsi="Times New Roman" w:cs="Times New Roman"/>
+          <w:b/>
+          <w:bCs/>
+          <w:sz w:val="26"/>
+          <w:szCs w:val="26"/>
+          <w:highlight w:val="white"/>
+        </w:rPr>
+        <w:t xml:space="preserve">umar </w:t>
+      </w:r>
+      <w:r>
+        <w:rPr>
+          <w:rFonts w:ascii="Times New Roman" w:eastAsia="Times New Roman" w:hAnsi="Times New Roman" w:cs="Times New Roman"/>
+          <w:b/>
+          <w:bCs/>
+          <w:sz w:val="26"/>
+          <w:szCs w:val="26"/>
+          <w:highlight w:val="white"/>
+        </w:rPr>
+        <w:t>–</w:t>
+      </w:r>
       <w:r>
         <w:rPr>
           <w:rFonts w:ascii="Times New Roman" w:eastAsia="Times New Roman" w:hAnsi="Times New Roman" w:cs="Times New Roman"/>
@@ -269,6 +300,407 @@
           <w:szCs w:val="26"/>
           <w:highlight w:val="white"/>
         </w:rPr>
+        <w:t>Conference Manager</w:t>
+      </w:r>
+    </w:p>
+    <w:p>
+      <w:pPr>
+        <w:rPr>
+          <w:rFonts w:ascii="Times New Roman" w:eastAsia="Times New Roman" w:hAnsi="Times New Roman" w:cs="Times New Roman"/>
+          <w:b/>
+          <w:bCs/>
+          <w:sz w:val="26"/>
+          <w:szCs w:val="26"/>
+          <w:highlight w:val="white"/>
+        </w:rPr>
+      </w:pPr>
+      <w:r>
+        <w:rPr>
+          <w:rFonts w:ascii="Times New Roman" w:eastAsia="Times New Roman" w:hAnsi="Times New Roman" w:cs="Times New Roman"/>
+          <w:b/>
+          <w:bCs/>
+          <w:sz w:val="26"/>
+          <w:szCs w:val="26"/>
+          <w:highlight w:val="white"/>
+        </w:rPr>
+        <w:t xml:space="preserve">Sisubaran Moovendhan </w:t>
+      </w:r>
+      <w:r>
+        <w:rPr>
+          <w:rFonts w:ascii="Times New Roman" w:eastAsia="Times New Roman" w:hAnsi="Times New Roman" w:cs="Times New Roman"/>
+          <w:b/>
+          <w:bCs/>
+          <w:sz w:val="26"/>
+          <w:szCs w:val="26"/>
+          <w:highlight w:val="white"/>
+        </w:rPr>
+        <w:t>–</w:t>
+      </w:r>
+      <w:r>
+        <w:rPr>
+          <w:rFonts w:ascii="Times New Roman" w:eastAsia="Times New Roman" w:hAnsi="Times New Roman" w:cs="Times New Roman"/>
+          <w:b/>
+          <w:bCs/>
+          <w:sz w:val="26"/>
+          <w:szCs w:val="26"/>
+          <w:highlight w:val="white"/>
+        </w:rPr>
+        <w:t xml:space="preserve"> </w:t>
+      </w:r>
+      <w:r>
+        <w:rPr>
+          <w:rFonts w:ascii="Times New Roman" w:eastAsia="Times New Roman" w:hAnsi="Times New Roman" w:cs="Times New Roman"/>
+          <w:b/>
+          <w:bCs/>
+          <w:sz w:val="26"/>
+          <w:szCs w:val="26"/>
+          <w:highlight w:val="white"/>
+        </w:rPr>
+        <w:t>Deputy Executive Director</w:t>
+      </w:r>
+    </w:p>
+    <w:p>
+      <w:pPr>
+        <w:rPr>
+          <w:rFonts w:ascii="Times New Roman" w:eastAsia="Times New Roman" w:hAnsi="Times New Roman" w:cs="Times New Roman"/>
+          <w:b/>
+          <w:bCs/>
+          <w:sz w:val="26"/>
+          <w:szCs w:val="26"/>
+          <w:highlight w:val="white"/>
+        </w:rPr>
+      </w:pPr>
+      <w:r>
+        <w:rPr>
+          <w:rFonts w:ascii="Times New Roman" w:eastAsia="Times New Roman" w:hAnsi="Times New Roman" w:cs="Times New Roman"/>
+          <w:b/>
+          <w:bCs/>
+          <w:sz w:val="26"/>
+          <w:szCs w:val="26"/>
+          <w:highlight w:val="white"/>
+        </w:rPr>
+        <w:t>Kavya D - Secretary of Conference</w:t>
+      </w:r>
+    </w:p>
+    <w:p>
+      <w:pPr>
+        <w:rPr>
+          <w:rFonts w:ascii="Times New Roman" w:eastAsia="Times New Roman" w:hAnsi="Times New Roman" w:cs="Times New Roman"/>
+          <w:b/>
+          <w:bCs/>
+          <w:sz w:val="26"/>
+          <w:szCs w:val="26"/>
+          <w:highlight w:val="white"/>
+        </w:rPr>
+      </w:pPr>
+      <w:r>
+        <w:rPr>
+          <w:rFonts w:ascii="Times New Roman" w:eastAsia="Times New Roman" w:hAnsi="Times New Roman" w:cs="Times New Roman"/>
+          <w:b/>
+          <w:bCs/>
+          <w:sz w:val="26"/>
+          <w:szCs w:val="26"/>
+          <w:highlight w:val="white"/>
+        </w:rPr>
+        <w:t>Lohith Tiruvuru - Director of Photography</w:t>
+      </w:r>
+    </w:p>
+    <w:p>
+      <w:pPr>
+        <w:rPr>
+          <w:rFonts w:ascii="Times New Roman" w:eastAsia="Times New Roman" w:hAnsi="Times New Roman" w:cs="Times New Roman"/>
+          <w:b/>
+          <w:bCs/>
+          <w:sz w:val="26"/>
+          <w:szCs w:val="26"/>
+          <w:highlight w:val="white"/>
+        </w:rPr>
+      </w:pPr>
+    </w:p>
+    <w:p>
+      <w:pPr>
+        <w:rPr>
+          <w:rFonts w:ascii="Times New Roman" w:eastAsia="Times New Roman" w:hAnsi="Times New Roman" w:cs="Times New Roman"/>
+          <w:b/>
+          <w:bCs/>
+          <w:sz w:val="26"/>
+          <w:szCs w:val="26"/>
+          <w:highlight w:val="white"/>
+        </w:rPr>
+      </w:pPr>
+      <w:r>
+        <w:rPr>
+          <w:rFonts w:ascii="Times New Roman" w:eastAsia="Times New Roman" w:hAnsi="Times New Roman" w:cs="Times New Roman"/>
+          <w:b/>
+          <w:bCs/>
+          <w:sz w:val="26"/>
+          <w:szCs w:val="26"/>
+          <w:highlight w:val="white"/>
+        </w:rPr>
+        <w:t>EXECUTIVE BOARD</w:t>
+      </w:r>
+    </w:p>
+    <w:p>
+      <w:pPr>
+        <w:rPr>
+          <w:rFonts w:ascii="Times New Roman" w:eastAsia="Times New Roman" w:hAnsi="Times New Roman" w:cs="Times New Roman"/>
+          <w:b/>
+          <w:bCs/>
+          <w:sz w:val="26"/>
+          <w:szCs w:val="26"/>
+          <w:highlight w:val="white"/>
+        </w:rPr>
+      </w:pPr>
+    </w:p>
+    <w:p>
+      <w:pPr>
+        <w:rPr>
+          <w:rFonts w:ascii="Times New Roman" w:eastAsia="Times New Roman" w:hAnsi="Times New Roman" w:cs="Times New Roman"/>
+          <w:b/>
+          <w:bCs/>
+          <w:sz w:val="26"/>
+          <w:szCs w:val="26"/>
+          <w:highlight w:val="white"/>
+        </w:rPr>
+      </w:pPr>
+      <w:r>
+        <w:rPr>
+          <w:rFonts w:ascii="Times New Roman" w:eastAsia="Times New Roman" w:hAnsi="Times New Roman" w:cs="Times New Roman"/>
+          <w:b/>
+          <w:bCs/>
+          <w:sz w:val="26"/>
+          <w:szCs w:val="26"/>
+          <w:highlight w:val="white"/>
+        </w:rPr>
+        <w:t>Forum Salutis (Health)</w:t>
+      </w:r>
+    </w:p>
+    <w:p>
+      <w:pPr>
+        <w:rPr>
+          <w:rFonts w:ascii="Times New Roman" w:eastAsia="Times New Roman" w:hAnsi="Times New Roman" w:cs="Times New Roman"/>
+          <w:b/>
+          <w:bCs/>
+          <w:sz w:val="26"/>
+          <w:szCs w:val="26"/>
+          <w:highlight w:val="white"/>
+        </w:rPr>
+      </w:pPr>
+      <w:r>
+        <w:rPr>
+          <w:rFonts w:ascii="Times New Roman" w:eastAsia="Times New Roman" w:hAnsi="Times New Roman" w:cs="Times New Roman"/>
+          <w:b/>
+          <w:bCs/>
+          <w:sz w:val="26"/>
+          <w:szCs w:val="26"/>
+          <w:highlight w:val="white"/>
+        </w:rPr>
+        <w:t xml:space="preserve">Raeed Aziz </w:t>
+      </w:r>
+      <w:r>
+        <w:rPr>
+          <w:rFonts w:ascii="Times New Roman" w:eastAsia="Times New Roman" w:hAnsi="Times New Roman" w:cs="Times New Roman"/>
+          <w:b/>
+          <w:bCs/>
+          <w:sz w:val="26"/>
+          <w:szCs w:val="26"/>
+        </w:rPr>
+        <w:t>Moinuddin</w:t>
+      </w:r>
+    </w:p>
+    <w:p>
+      <w:pPr>
+        <w:rPr>
+          <w:rFonts w:ascii="Times New Roman" w:eastAsia="Times New Roman" w:hAnsi="Times New Roman" w:cs="Times New Roman"/>
+          <w:b/>
+          <w:bCs/>
+          <w:sz w:val="26"/>
+          <w:szCs w:val="26"/>
+          <w:highlight w:val="white"/>
+        </w:rPr>
+      </w:pPr>
+      <w:r>
+        <w:rPr>
+          <w:rFonts w:ascii="Times New Roman" w:eastAsia="Times New Roman" w:hAnsi="Times New Roman" w:cs="Times New Roman"/>
+          <w:b/>
+          <w:bCs/>
+          <w:sz w:val="26"/>
+          <w:szCs w:val="26"/>
+          <w:highlight w:val="white"/>
+        </w:rPr>
+        <w:t xml:space="preserve">Sudharshini </w:t>
+      </w:r>
+    </w:p>
+    <w:p>
+      <w:pPr>
+        <w:rPr>
+          <w:rFonts w:ascii="Times New Roman" w:eastAsia="Times New Roman" w:hAnsi="Times New Roman" w:cs="Times New Roman"/>
+          <w:b/>
+          <w:bCs/>
+          <w:sz w:val="26"/>
+          <w:szCs w:val="26"/>
+          <w:highlight w:val="white"/>
+        </w:rPr>
+      </w:pPr>
+    </w:p>
+    <w:p>
+      <w:pPr>
+        <w:rPr>
+          <w:rFonts w:ascii="Times New Roman" w:eastAsia="Times New Roman" w:hAnsi="Times New Roman" w:cs="Times New Roman"/>
+          <w:b/>
+          <w:bCs/>
+          <w:sz w:val="26"/>
+          <w:szCs w:val="26"/>
+          <w:highlight w:val="white"/>
+        </w:rPr>
+      </w:pPr>
+      <w:r>
+        <w:rPr>
+          <w:rFonts w:ascii="Times New Roman" w:eastAsia="Times New Roman" w:hAnsi="Times New Roman" w:cs="Times New Roman"/>
+          <w:b/>
+          <w:bCs/>
+          <w:sz w:val="26"/>
+          <w:szCs w:val="26"/>
+          <w:highlight w:val="white"/>
+        </w:rPr>
+        <w:t>Forum Terra (Environment)</w:t>
+      </w:r>
+    </w:p>
+    <w:p>
+      <w:pPr>
+        <w:rPr>
+          <w:rFonts w:ascii="Times New Roman" w:eastAsia="Times New Roman" w:hAnsi="Times New Roman" w:cs="Times New Roman"/>
+          <w:b/>
+          <w:bCs/>
+          <w:sz w:val="26"/>
+          <w:szCs w:val="26"/>
+          <w:highlight w:val="white"/>
+        </w:rPr>
+      </w:pPr>
+      <w:r>
+        <w:rPr>
+          <w:rFonts w:ascii="Times New Roman" w:eastAsia="Times New Roman" w:hAnsi="Times New Roman" w:cs="Times New Roman"/>
+          <w:b/>
+          <w:bCs/>
+          <w:sz w:val="26"/>
+          <w:szCs w:val="26"/>
+          <w:highlight w:val="white"/>
+        </w:rPr>
+        <w:t>Pushpak Natarajan</w:t>
+      </w:r>
+    </w:p>
+    <w:p>
+      <w:pPr>
+        <w:rPr>
+          <w:rFonts w:ascii="Times New Roman" w:eastAsia="Times New Roman" w:hAnsi="Times New Roman" w:cs="Times New Roman"/>
+          <w:b/>
+          <w:bCs/>
+          <w:sz w:val="26"/>
+          <w:szCs w:val="26"/>
+          <w:highlight w:val="white"/>
+        </w:rPr>
+      </w:pPr>
+      <w:r>
+        <w:rPr>
+          <w:rFonts w:ascii="Times New Roman" w:eastAsia="Times New Roman" w:hAnsi="Times New Roman" w:cs="Times New Roman"/>
+          <w:b/>
+          <w:bCs/>
+          <w:sz w:val="26"/>
+          <w:szCs w:val="26"/>
+          <w:highlight w:val="white"/>
+        </w:rPr>
+        <w:t>Mridula Krishnan</w:t>
+      </w:r>
+    </w:p>
+    <w:p>
+      <w:pPr>
+        <w:rPr>
+          <w:rFonts w:ascii="Times New Roman" w:eastAsia="Times New Roman" w:hAnsi="Times New Roman" w:cs="Times New Roman"/>
+          <w:b/>
+          <w:bCs/>
+          <w:sz w:val="26"/>
+          <w:szCs w:val="26"/>
+          <w:highlight w:val="white"/>
+        </w:rPr>
+      </w:pPr>
+    </w:p>
+    <w:p>
+      <w:pPr>
+        <w:rPr>
+          <w:rFonts w:ascii="Times New Roman" w:eastAsia="Times New Roman" w:hAnsi="Times New Roman" w:cs="Times New Roman"/>
+          <w:b/>
+          <w:bCs/>
+          <w:sz w:val="26"/>
+          <w:szCs w:val="26"/>
+          <w:highlight w:val="white"/>
+        </w:rPr>
+      </w:pPr>
+      <w:r>
+        <w:rPr>
+          <w:rFonts w:ascii="Times New Roman" w:eastAsia="Times New Roman" w:hAnsi="Times New Roman" w:cs="Times New Roman"/>
+          <w:b/>
+          <w:bCs/>
+          <w:sz w:val="26"/>
+          <w:szCs w:val="26"/>
+          <w:highlight w:val="white"/>
+        </w:rPr>
+        <w:t>Forum Mercatus (Economy)</w:t>
+      </w:r>
+    </w:p>
+    <w:p>
+      <w:pPr>
+        <w:rPr>
+          <w:rFonts w:ascii="Times New Roman" w:eastAsia="Times New Roman" w:hAnsi="Times New Roman" w:cs="Times New Roman"/>
+          <w:b/>
+          <w:bCs/>
+          <w:sz w:val="26"/>
+          <w:szCs w:val="26"/>
+          <w:highlight w:val="white"/>
+        </w:rPr>
+      </w:pPr>
+      <w:r>
+        <w:rPr>
+          <w:rFonts w:ascii="Times New Roman" w:eastAsia="Times New Roman" w:hAnsi="Times New Roman" w:cs="Times New Roman"/>
+          <w:b/>
+          <w:bCs/>
+          <w:sz w:val="26"/>
+          <w:szCs w:val="26"/>
+          <w:highlight w:val="white"/>
+        </w:rPr>
+        <w:t>Ashvardh Dinesh</w:t>
+      </w:r>
+    </w:p>
+    <w:p>
+      <w:pPr>
+        <w:rPr>
+          <w:rFonts w:ascii="Times New Roman" w:eastAsia="Times New Roman" w:hAnsi="Times New Roman" w:cs="Times New Roman"/>
+          <w:b/>
+          <w:bCs/>
+          <w:sz w:val="26"/>
+          <w:szCs w:val="26"/>
+          <w:highlight w:val="white"/>
+        </w:rPr>
+      </w:pPr>
+      <w:r>
+        <w:rPr>
+          <w:rFonts w:ascii="Times New Roman" w:eastAsia="Times New Roman" w:hAnsi="Times New Roman" w:cs="Times New Roman"/>
+          <w:b/>
+          <w:bCs/>
+          <w:sz w:val="26"/>
+          <w:szCs w:val="26"/>
+          <w:highlight w:val="white"/>
+        </w:rPr>
+        <w:t xml:space="preserve">Chaarika </w:t>
+      </w:r>
+      <w:r>
+        <w:rPr>
+          <w:rFonts w:ascii="Times New Roman" w:eastAsia="Times New Roman" w:hAnsi="Times New Roman" w:cs="Times New Roman"/>
+          <w:b/>
+          <w:bCs/>
+          <w:sz w:val="26"/>
+          <w:szCs w:val="26"/>
+          <w:highlight w:val="white"/>
+        </w:rPr>
         <w:t>K</w:t>
       </w:r>
       <w:r>
@@ -280,525 +712,6 @@
           <w:szCs w:val="26"/>
           <w:highlight w:val="white"/>
         </w:rPr>
-        <w:t xml:space="preserve">umar </w:t>
-      </w:r>
-      <w:r>
-        <w:rPr>
-          <w:rFonts w:ascii="Times New Roman" w:eastAsia="Times New Roman" w:hAnsi="Times New Roman" w:cs="Times New Roman"/>
-          <w:b/>
-          <w:bCs/>
-          <w:sz w:val="26"/>
-          <w:szCs w:val="26"/>
-          <w:highlight w:val="white"/>
-        </w:rPr>
-        <w:t>–</w:t>
-      </w:r>
-      <w:r>
-        <w:rPr>
-          <w:rFonts w:ascii="Times New Roman" w:eastAsia="Times New Roman" w:hAnsi="Times New Roman" w:cs="Times New Roman"/>
-          <w:b/>
-          <w:bCs/>
-          <w:sz w:val="26"/>
-          <w:szCs w:val="26"/>
-          <w:highlight w:val="white"/>
-        </w:rPr>
-        <w:t xml:space="preserve"> </w:t>
-      </w:r>
-      <w:r>
-        <w:rPr>
-          <w:rFonts w:ascii="Times New Roman" w:eastAsia="Times New Roman" w:hAnsi="Times New Roman" w:cs="Times New Roman"/>
-          <w:b/>
-          <w:bCs/>
-          <w:sz w:val="26"/>
-          <w:szCs w:val="26"/>
-          <w:highlight w:val="white"/>
-        </w:rPr>
-        <w:t>Conference Manager</w:t>
-      </w:r>
-    </w:p>
-    <w:p>
-      <w:pPr>
-        <w:rPr>
-          <w:rFonts w:ascii="Times New Roman" w:eastAsia="Times New Roman" w:hAnsi="Times New Roman" w:cs="Times New Roman"/>
-          <w:b/>
-          <w:bCs/>
-          <w:sz w:val="26"/>
-          <w:szCs w:val="26"/>
-          <w:highlight w:val="white"/>
-        </w:rPr>
-      </w:pPr>
-      <w:proofErr w:type="spellStart"/>
-      <w:r>
-        <w:rPr>
-          <w:rFonts w:ascii="Times New Roman" w:eastAsia="Times New Roman" w:hAnsi="Times New Roman" w:cs="Times New Roman"/>
-          <w:b/>
-          <w:bCs/>
-          <w:sz w:val="26"/>
-          <w:szCs w:val="26"/>
-          <w:highlight w:val="white"/>
-        </w:rPr>
-        <w:t>Sisubaran</w:t>
-      </w:r>
-      <w:proofErr w:type="spellEnd"/>
-      <w:r>
-        <w:rPr>
-          <w:rFonts w:ascii="Times New Roman" w:eastAsia="Times New Roman" w:hAnsi="Times New Roman" w:cs="Times New Roman"/>
-          <w:b/>
-          <w:bCs/>
-          <w:sz w:val="26"/>
-          <w:szCs w:val="26"/>
-          <w:highlight w:val="white"/>
-        </w:rPr>
-        <w:t xml:space="preserve"> Moovendhan </w:t>
-      </w:r>
-      <w:r>
-        <w:rPr>
-          <w:rFonts w:ascii="Times New Roman" w:eastAsia="Times New Roman" w:hAnsi="Times New Roman" w:cs="Times New Roman"/>
-          <w:b/>
-          <w:bCs/>
-          <w:sz w:val="26"/>
-          <w:szCs w:val="26"/>
-          <w:highlight w:val="white"/>
-        </w:rPr>
-        <w:t>–</w:t>
-      </w:r>
-      <w:r>
-        <w:rPr>
-          <w:rFonts w:ascii="Times New Roman" w:eastAsia="Times New Roman" w:hAnsi="Times New Roman" w:cs="Times New Roman"/>
-          <w:b/>
-          <w:bCs/>
-          <w:sz w:val="26"/>
-          <w:szCs w:val="26"/>
-          <w:highlight w:val="white"/>
-        </w:rPr>
-        <w:t xml:space="preserve"> </w:t>
-      </w:r>
-      <w:r>
-        <w:rPr>
-          <w:rFonts w:ascii="Times New Roman" w:eastAsia="Times New Roman" w:hAnsi="Times New Roman" w:cs="Times New Roman"/>
-          <w:b/>
-          <w:bCs/>
-          <w:sz w:val="26"/>
-          <w:szCs w:val="26"/>
-          <w:highlight w:val="white"/>
-        </w:rPr>
-        <w:t>Deputy Executive Director</w:t>
-      </w:r>
-    </w:p>
-    <w:p>
-      <w:pPr>
-        <w:rPr>
-          <w:rFonts w:ascii="Times New Roman" w:eastAsia="Times New Roman" w:hAnsi="Times New Roman" w:cs="Times New Roman"/>
-          <w:b/>
-          <w:bCs/>
-          <w:sz w:val="26"/>
-          <w:szCs w:val="26"/>
-          <w:highlight w:val="white"/>
-        </w:rPr>
-      </w:pPr>
-      <w:r>
-        <w:rPr>
-          <w:rFonts w:ascii="Times New Roman" w:eastAsia="Times New Roman" w:hAnsi="Times New Roman" w:cs="Times New Roman"/>
-          <w:b/>
-          <w:bCs/>
-          <w:sz w:val="26"/>
-          <w:szCs w:val="26"/>
-          <w:highlight w:val="white"/>
-        </w:rPr>
-        <w:t>Kavya D - Secretary of Conference</w:t>
-      </w:r>
-    </w:p>
-    <w:p>
-      <w:pPr>
-        <w:rPr>
-          <w:rFonts w:ascii="Times New Roman" w:eastAsia="Times New Roman" w:hAnsi="Times New Roman" w:cs="Times New Roman"/>
-          <w:b/>
-          <w:bCs/>
-          <w:sz w:val="26"/>
-          <w:szCs w:val="26"/>
-          <w:highlight w:val="white"/>
-        </w:rPr>
-      </w:pPr>
-      <w:r>
-        <w:rPr>
-          <w:rFonts w:ascii="Times New Roman" w:eastAsia="Times New Roman" w:hAnsi="Times New Roman" w:cs="Times New Roman"/>
-          <w:b/>
-          <w:bCs/>
-          <w:sz w:val="26"/>
-          <w:szCs w:val="26"/>
-          <w:highlight w:val="white"/>
-        </w:rPr>
-        <w:t xml:space="preserve">Lohith </w:t>
-      </w:r>
-      <w:proofErr w:type="spellStart"/>
-      <w:r>
-        <w:rPr>
-          <w:rFonts w:ascii="Times New Roman" w:eastAsia="Times New Roman" w:hAnsi="Times New Roman" w:cs="Times New Roman"/>
-          <w:b/>
-          <w:bCs/>
-          <w:sz w:val="26"/>
-          <w:szCs w:val="26"/>
-          <w:highlight w:val="white"/>
-        </w:rPr>
-        <w:t>Tiruvuru</w:t>
-      </w:r>
-      <w:proofErr w:type="spellEnd"/>
-      <w:r>
-        <w:rPr>
-          <w:rFonts w:ascii="Times New Roman" w:eastAsia="Times New Roman" w:hAnsi="Times New Roman" w:cs="Times New Roman"/>
-          <w:b/>
-          <w:bCs/>
-          <w:sz w:val="26"/>
-          <w:szCs w:val="26"/>
-          <w:highlight w:val="white"/>
-        </w:rPr>
-        <w:t xml:space="preserve"> - Director of Photography</w:t>
-      </w:r>
-    </w:p>
-    <w:p>
-      <w:pPr>
-        <w:rPr>
-          <w:rFonts w:ascii="Times New Roman" w:eastAsia="Times New Roman" w:hAnsi="Times New Roman" w:cs="Times New Roman"/>
-          <w:b/>
-          <w:bCs/>
-          <w:sz w:val="26"/>
-          <w:szCs w:val="26"/>
-          <w:highlight w:val="white"/>
-        </w:rPr>
-      </w:pPr>
-    </w:p>
-    <w:p>
-      <w:pPr>
-        <w:rPr>
-          <w:rFonts w:ascii="Times New Roman" w:eastAsia="Times New Roman" w:hAnsi="Times New Roman" w:cs="Times New Roman"/>
-          <w:b/>
-          <w:bCs/>
-          <w:sz w:val="26"/>
-          <w:szCs w:val="26"/>
-          <w:highlight w:val="white"/>
-        </w:rPr>
-      </w:pPr>
-      <w:r>
-        <w:rPr>
-          <w:rFonts w:ascii="Times New Roman" w:eastAsia="Times New Roman" w:hAnsi="Times New Roman" w:cs="Times New Roman"/>
-          <w:b/>
-          <w:bCs/>
-          <w:sz w:val="26"/>
-          <w:szCs w:val="26"/>
-          <w:highlight w:val="white"/>
-        </w:rPr>
-        <w:t>EXECUTIVE BOARD</w:t>
-      </w:r>
-    </w:p>
-    <w:p>
-      <w:pPr>
-        <w:rPr>
-          <w:rFonts w:ascii="Times New Roman" w:eastAsia="Times New Roman" w:hAnsi="Times New Roman" w:cs="Times New Roman"/>
-          <w:b/>
-          <w:bCs/>
-          <w:sz w:val="26"/>
-          <w:szCs w:val="26"/>
-          <w:highlight w:val="white"/>
-        </w:rPr>
-      </w:pPr>
-    </w:p>
-    <w:p>
-      <w:pPr>
-        <w:rPr>
-          <w:rFonts w:ascii="Times New Roman" w:eastAsia="Times New Roman" w:hAnsi="Times New Roman" w:cs="Times New Roman"/>
-          <w:b/>
-          <w:bCs/>
-          <w:sz w:val="26"/>
-          <w:szCs w:val="26"/>
-          <w:highlight w:val="white"/>
-        </w:rPr>
-      </w:pPr>
-      <w:r>
-        <w:rPr>
-          <w:rFonts w:ascii="Times New Roman" w:eastAsia="Times New Roman" w:hAnsi="Times New Roman" w:cs="Times New Roman"/>
-          <w:b/>
-          <w:bCs/>
-          <w:sz w:val="26"/>
-          <w:szCs w:val="26"/>
-          <w:highlight w:val="white"/>
-        </w:rPr>
-        <w:t xml:space="preserve">Forum </w:t>
-      </w:r>
-      <w:proofErr w:type="spellStart"/>
-      <w:r>
-        <w:rPr>
-          <w:rFonts w:ascii="Times New Roman" w:eastAsia="Times New Roman" w:hAnsi="Times New Roman" w:cs="Times New Roman"/>
-          <w:b/>
-          <w:bCs/>
-          <w:sz w:val="26"/>
-          <w:szCs w:val="26"/>
-          <w:highlight w:val="white"/>
-        </w:rPr>
-        <w:t>Salutis</w:t>
-      </w:r>
-      <w:proofErr w:type="spellEnd"/>
-      <w:r>
-        <w:rPr>
-          <w:rFonts w:ascii="Times New Roman" w:eastAsia="Times New Roman" w:hAnsi="Times New Roman" w:cs="Times New Roman"/>
-          <w:b/>
-          <w:bCs/>
-          <w:sz w:val="26"/>
-          <w:szCs w:val="26"/>
-          <w:highlight w:val="white"/>
-        </w:rPr>
-        <w:t xml:space="preserve"> (Health)</w:t>
-      </w:r>
-    </w:p>
-    <w:p>
-      <w:pPr>
-        <w:rPr>
-          <w:rFonts w:ascii="Times New Roman" w:eastAsia="Times New Roman" w:hAnsi="Times New Roman" w:cs="Times New Roman"/>
-          <w:b/>
-          <w:bCs/>
-          <w:sz w:val="26"/>
-          <w:szCs w:val="26"/>
-          <w:highlight w:val="white"/>
-        </w:rPr>
-      </w:pPr>
-      <w:r>
-        <w:rPr>
-          <w:rFonts w:ascii="Times New Roman" w:eastAsia="Times New Roman" w:hAnsi="Times New Roman" w:cs="Times New Roman"/>
-          <w:b/>
-          <w:bCs/>
-          <w:sz w:val="26"/>
-          <w:szCs w:val="26"/>
-          <w:highlight w:val="white"/>
-        </w:rPr>
-        <w:t xml:space="preserve">Raeed Aziz </w:t>
-      </w:r>
-      <w:r>
-        <w:rPr>
-          <w:rFonts w:ascii="Times New Roman" w:eastAsia="Times New Roman" w:hAnsi="Times New Roman" w:cs="Times New Roman"/>
-          <w:b/>
-          <w:bCs/>
-          <w:sz w:val="26"/>
-          <w:szCs w:val="26"/>
-        </w:rPr>
-        <w:t>Moinuddin</w:t>
-      </w:r>
-    </w:p>
-    <w:p>
-      <w:pPr>
-        <w:rPr>
-          <w:rFonts w:ascii="Times New Roman" w:eastAsia="Times New Roman" w:hAnsi="Times New Roman" w:cs="Times New Roman"/>
-          <w:b/>
-          <w:bCs/>
-          <w:sz w:val="26"/>
-          <w:szCs w:val="26"/>
-          <w:highlight w:val="white"/>
-        </w:rPr>
-      </w:pPr>
-      <w:r>
-        <w:rPr>
-          <w:rFonts w:ascii="Times New Roman" w:eastAsia="Times New Roman" w:hAnsi="Times New Roman" w:cs="Times New Roman"/>
-          <w:b/>
-          <w:bCs/>
-          <w:sz w:val="26"/>
-          <w:szCs w:val="26"/>
-          <w:highlight w:val="white"/>
-        </w:rPr>
-        <w:t xml:space="preserve">Sudharshini </w:t>
-      </w:r>
-    </w:p>
-    <w:p>
-      <w:pPr>
-        <w:rPr>
-          <w:rFonts w:ascii="Times New Roman" w:eastAsia="Times New Roman" w:hAnsi="Times New Roman" w:cs="Times New Roman"/>
-          <w:b/>
-          <w:bCs/>
-          <w:sz w:val="26"/>
-          <w:szCs w:val="26"/>
-          <w:highlight w:val="white"/>
-        </w:rPr>
-      </w:pPr>
-    </w:p>
-    <w:p>
-      <w:pPr>
-        <w:rPr>
-          <w:rFonts w:ascii="Times New Roman" w:eastAsia="Times New Roman" w:hAnsi="Times New Roman" w:cs="Times New Roman"/>
-          <w:b/>
-          <w:bCs/>
-          <w:sz w:val="26"/>
-          <w:szCs w:val="26"/>
-          <w:highlight w:val="white"/>
-        </w:rPr>
-      </w:pPr>
-      <w:r>
-        <w:rPr>
-          <w:rFonts w:ascii="Times New Roman" w:eastAsia="Times New Roman" w:hAnsi="Times New Roman" w:cs="Times New Roman"/>
-          <w:b/>
-          <w:bCs/>
-          <w:sz w:val="26"/>
-          <w:szCs w:val="26"/>
-          <w:highlight w:val="white"/>
-        </w:rPr>
-        <w:t>Forum Terra (Environment)</w:t>
-      </w:r>
-    </w:p>
-    <w:p>
-      <w:pPr>
-        <w:rPr>
-          <w:rFonts w:ascii="Times New Roman" w:eastAsia="Times New Roman" w:hAnsi="Times New Roman" w:cs="Times New Roman"/>
-          <w:b/>
-          <w:bCs/>
-          <w:sz w:val="26"/>
-          <w:szCs w:val="26"/>
-          <w:highlight w:val="white"/>
-        </w:rPr>
-      </w:pPr>
-      <w:r>
-        <w:rPr>
-          <w:rFonts w:ascii="Times New Roman" w:eastAsia="Times New Roman" w:hAnsi="Times New Roman" w:cs="Times New Roman"/>
-          <w:b/>
-          <w:bCs/>
-          <w:sz w:val="26"/>
-          <w:szCs w:val="26"/>
-          <w:highlight w:val="white"/>
-        </w:rPr>
-        <w:t>Pushpak Natarajan</w:t>
-      </w:r>
-    </w:p>
-    <w:p>
-      <w:pPr>
-        <w:rPr>
-          <w:rFonts w:ascii="Times New Roman" w:eastAsia="Times New Roman" w:hAnsi="Times New Roman" w:cs="Times New Roman"/>
-          <w:b/>
-          <w:bCs/>
-          <w:sz w:val="26"/>
-          <w:szCs w:val="26"/>
-          <w:highlight w:val="white"/>
-        </w:rPr>
-      </w:pPr>
-      <w:r>
-        <w:rPr>
-          <w:rFonts w:ascii="Times New Roman" w:eastAsia="Times New Roman" w:hAnsi="Times New Roman" w:cs="Times New Roman"/>
-          <w:b/>
-          <w:bCs/>
-          <w:sz w:val="26"/>
-          <w:szCs w:val="26"/>
-          <w:highlight w:val="white"/>
-        </w:rPr>
-        <w:t>Mridula Krishnan</w:t>
-      </w:r>
-    </w:p>
-    <w:p>
-      <w:pPr>
-        <w:rPr>
-          <w:rFonts w:ascii="Times New Roman" w:eastAsia="Times New Roman" w:hAnsi="Times New Roman" w:cs="Times New Roman"/>
-          <w:b/>
-          <w:bCs/>
-          <w:sz w:val="26"/>
-          <w:szCs w:val="26"/>
-          <w:highlight w:val="white"/>
-        </w:rPr>
-      </w:pPr>
-    </w:p>
-    <w:p>
-      <w:pPr>
-        <w:rPr>
-          <w:rFonts w:ascii="Times New Roman" w:eastAsia="Times New Roman" w:hAnsi="Times New Roman" w:cs="Times New Roman"/>
-          <w:b/>
-          <w:bCs/>
-          <w:sz w:val="26"/>
-          <w:szCs w:val="26"/>
-          <w:highlight w:val="white"/>
-        </w:rPr>
-      </w:pPr>
-      <w:r>
-        <w:rPr>
-          <w:rFonts w:ascii="Times New Roman" w:eastAsia="Times New Roman" w:hAnsi="Times New Roman" w:cs="Times New Roman"/>
-          <w:b/>
-          <w:bCs/>
-          <w:sz w:val="26"/>
-          <w:szCs w:val="26"/>
-          <w:highlight w:val="white"/>
-        </w:rPr>
-        <w:t>Forum Mercatus (Economy)</w:t>
-      </w:r>
-    </w:p>
-    <w:p>
-      <w:pPr>
-        <w:rPr>
-          <w:rFonts w:ascii="Times New Roman" w:eastAsia="Times New Roman" w:hAnsi="Times New Roman" w:cs="Times New Roman"/>
-          <w:b/>
-          <w:bCs/>
-          <w:sz w:val="26"/>
-          <w:szCs w:val="26"/>
-          <w:highlight w:val="white"/>
-        </w:rPr>
-      </w:pPr>
-      <w:r>
-        <w:rPr>
-          <w:rFonts w:ascii="Times New Roman" w:eastAsia="Times New Roman" w:hAnsi="Times New Roman" w:cs="Times New Roman"/>
-          <w:b/>
-          <w:bCs/>
-          <w:sz w:val="26"/>
-          <w:szCs w:val="26"/>
-          <w:highlight w:val="white"/>
-        </w:rPr>
-        <w:t>Ashvardh Dinesh</w:t>
-      </w:r>
-    </w:p>
-    <w:p>
-      <w:pPr>
-        <w:rPr>
-          <w:rFonts w:ascii="Times New Roman" w:eastAsia="Times New Roman" w:hAnsi="Times New Roman" w:cs="Times New Roman"/>
-          <w:b/>
-          <w:bCs/>
-          <w:sz w:val="26"/>
-          <w:szCs w:val="26"/>
-          <w:highlight w:val="white"/>
-        </w:rPr>
-      </w:pPr>
-      <w:proofErr w:type="spellStart"/>
-      <w:r>
-        <w:rPr>
-          <w:rFonts w:ascii="Times New Roman" w:eastAsia="Times New Roman" w:hAnsi="Times New Roman" w:cs="Times New Roman"/>
-          <w:b/>
-          <w:bCs/>
-          <w:sz w:val="26"/>
-          <w:szCs w:val="26"/>
-          <w:highlight w:val="white"/>
-        </w:rPr>
-        <w:t>Chaarika</w:t>
-      </w:r>
-      <w:proofErr w:type="spellEnd"/>
-      <w:r>
-        <w:rPr>
-          <w:rFonts w:ascii="Times New Roman" w:eastAsia="Times New Roman" w:hAnsi="Times New Roman" w:cs="Times New Roman"/>
-          <w:b/>
-          <w:bCs/>
-          <w:sz w:val="26"/>
-          <w:szCs w:val="26"/>
-          <w:highlight w:val="white"/>
-        </w:rPr>
-        <w:t xml:space="preserve"> </w:t>
-      </w:r>
-      <w:r>
-        <w:rPr>
-          <w:rFonts w:ascii="Times New Roman" w:eastAsia="Times New Roman" w:hAnsi="Times New Roman" w:cs="Times New Roman"/>
-          <w:b/>
-          <w:bCs/>
-          <w:sz w:val="26"/>
-          <w:szCs w:val="26"/>
-          <w:highlight w:val="white"/>
-        </w:rPr>
-        <w:t>K</w:t>
-      </w:r>
-      <w:r>
-        <w:rPr>
-          <w:rFonts w:ascii="Times New Roman" w:eastAsia="Times New Roman" w:hAnsi="Times New Roman" w:cs="Times New Roman"/>
-          <w:b/>
-          <w:bCs/>
-          <w:sz w:val="26"/>
-          <w:szCs w:val="26"/>
-          <w:highlight w:val="white"/>
-        </w:rPr>
         <w:t>umar</w:t>
       </w:r>
     </w:p>
@@ -871,29 +784,16 @@
           <w:highlight w:val="white"/>
         </w:rPr>
       </w:pPr>
-      <w:proofErr w:type="spellStart"/>
-      <w:r>
-        <w:rPr>
-          <w:rFonts w:ascii="Times New Roman" w:eastAsia="Times New Roman" w:hAnsi="Times New Roman" w:cs="Times New Roman"/>
-          <w:b/>
-          <w:bCs/>
-          <w:sz w:val="26"/>
-          <w:szCs w:val="26"/>
-          <w:highlight w:val="white"/>
-        </w:rPr>
-        <w:t>Sisubaran</w:t>
-      </w:r>
-      <w:proofErr w:type="spellEnd"/>
-      <w:r>
-        <w:rPr>
-          <w:rFonts w:ascii="Times New Roman" w:eastAsia="Times New Roman" w:hAnsi="Times New Roman" w:cs="Times New Roman"/>
-          <w:b/>
-          <w:bCs/>
-          <w:sz w:val="26"/>
-          <w:szCs w:val="26"/>
-          <w:highlight w:val="white"/>
-        </w:rPr>
-        <w:t xml:space="preserve"> Moovendhan</w:t>
+      <w:r>
+        <w:rPr>
+          <w:rFonts w:ascii="Times New Roman" w:eastAsia="Times New Roman" w:hAnsi="Times New Roman" w:cs="Times New Roman"/>
+          <w:b/>
+          <w:bCs/>
+          <w:sz w:val="26"/>
+          <w:szCs w:val="26"/>
+          <w:highlight w:val="white"/>
+        </w:rPr>
+        <w:t>Sisubaran Moovendhan</w:t>
       </w:r>
     </w:p>
     <w:p>
@@ -951,78 +851,30 @@
           <w:szCs w:val="26"/>
           <w:highlight w:val="white"/>
         </w:rPr>
-        <w:t xml:space="preserve">Forum </w:t>
-      </w:r>
-      <w:proofErr w:type="spellStart"/>
-      <w:r>
-        <w:rPr>
-          <w:rFonts w:ascii="Times New Roman" w:eastAsia="Times New Roman" w:hAnsi="Times New Roman" w:cs="Times New Roman"/>
-          <w:b/>
-          <w:bCs/>
-          <w:sz w:val="26"/>
-          <w:szCs w:val="26"/>
-          <w:highlight w:val="white"/>
-        </w:rPr>
-        <w:t>Athleticum</w:t>
-      </w:r>
-      <w:proofErr w:type="spellEnd"/>
-      <w:r>
-        <w:rPr>
-          <w:rFonts w:ascii="Times New Roman" w:eastAsia="Times New Roman" w:hAnsi="Times New Roman" w:cs="Times New Roman"/>
-          <w:b/>
-          <w:bCs/>
-          <w:sz w:val="26"/>
-          <w:szCs w:val="26"/>
-          <w:highlight w:val="white"/>
-        </w:rPr>
-        <w:t xml:space="preserve"> (Sports)</w:t>
-      </w:r>
-    </w:p>
-    <w:p>
-      <w:pPr>
-        <w:rPr>
-          <w:rFonts w:ascii="Times New Roman" w:eastAsia="Times New Roman" w:hAnsi="Times New Roman" w:cs="Times New Roman"/>
-          <w:b/>
-          <w:bCs/>
-          <w:sz w:val="26"/>
-          <w:szCs w:val="26"/>
-          <w:highlight w:val="white"/>
-        </w:rPr>
-      </w:pPr>
-      <w:r>
-        <w:rPr>
-          <w:rFonts w:ascii="Times New Roman" w:eastAsia="Times New Roman" w:hAnsi="Times New Roman" w:cs="Times New Roman"/>
-          <w:b/>
-          <w:bCs/>
-          <w:sz w:val="26"/>
-          <w:szCs w:val="26"/>
-          <w:highlight w:val="white"/>
-        </w:rPr>
-        <w:t xml:space="preserve">Lohith </w:t>
-      </w:r>
-      <w:proofErr w:type="spellStart"/>
-      <w:r>
-        <w:rPr>
-          <w:rFonts w:ascii="Times New Roman" w:eastAsia="Times New Roman" w:hAnsi="Times New Roman" w:cs="Times New Roman"/>
-          <w:b/>
-          <w:bCs/>
-          <w:sz w:val="26"/>
-          <w:szCs w:val="26"/>
-          <w:highlight w:val="white"/>
-        </w:rPr>
-        <w:t>Tiruvuru</w:t>
-      </w:r>
-      <w:proofErr w:type="spellEnd"/>
-      <w:r>
-        <w:rPr>
-          <w:rFonts w:ascii="Times New Roman" w:eastAsia="Times New Roman" w:hAnsi="Times New Roman" w:cs="Times New Roman"/>
-          <w:b/>
-          <w:bCs/>
-          <w:sz w:val="26"/>
-          <w:szCs w:val="26"/>
-          <w:highlight w:val="white"/>
-        </w:rPr>
-        <w:t xml:space="preserve"> </w:t>
+        <w:t>Forum Athleticum (Sports)</w:t>
+      </w:r>
+    </w:p>
+    <w:p>
+      <w:pPr>
+        <w:rPr>
+          <w:rFonts w:ascii="Times New Roman" w:eastAsia="Times New Roman" w:hAnsi="Times New Roman" w:cs="Times New Roman"/>
+          <w:b/>
+          <w:bCs/>
+          <w:sz w:val="26"/>
+          <w:szCs w:val="26"/>
+          <w:highlight w:val="white"/>
+        </w:rPr>
+      </w:pPr>
+      <w:r>
+        <w:rPr>
+          <w:rFonts w:ascii="Times New Roman" w:eastAsia="Times New Roman" w:hAnsi="Times New Roman" w:cs="Times New Roman"/>
+          <w:b/>
+          <w:bCs/>
+          <w:sz w:val="26"/>
+          <w:szCs w:val="26"/>
+          <w:highlight w:val="white"/>
+        </w:rPr>
+        <w:t xml:space="preserve">Lohith Tiruvuru </w:t>
       </w:r>
     </w:p>
     <w:p>
@@ -1138,7 +990,7 @@
           <w:szCs w:val="26"/>
           <w:highlight w:val="white"/>
         </w:rPr>
-        <w:t>Sudharshini</w:t>
+        <w:t>Devamilanie</w:t>
       </w:r>
     </w:p>
     <w:p>

</xml_diff>

<commit_message>
Add Sudharshini back to Salutis EB, enlarge hamburger tap target on phone
Co-Authored-By: Claude Fable 5 <noreply@anthropic.com>
</commit_message>
<xml_diff>
--- a/STUFF/CORE SECRETRIAT AND EXECUTIVE BOARD.docx
+++ b/STUFF/CORE SECRETRIAT AND EXECUTIVE BOARD.docx
@@ -483,7 +483,6 @@
           <w:bCs/>
           <w:sz w:val="26"/>
           <w:szCs w:val="26"/>
-          <w:highlight w:val="white"/>
         </w:rPr>
       </w:pPr>
       <w:r>
@@ -506,6 +505,28 @@
           <w:szCs w:val="26"/>
         </w:rPr>
         <w:t>Moinuddin</w:t>
+      </w:r>
+    </w:p>
+    <w:p>
+      <w:pPr>
+        <w:rPr>
+          <w:rFonts w:ascii="Times New Roman" w:eastAsia="Times New Roman" w:hAnsi="Times New Roman" w:cs="Times New Roman"/>
+          <w:b/>
+          <w:bCs/>
+          <w:sz w:val="26"/>
+          <w:szCs w:val="26"/>
+          <w:highlight w:val="white"/>
+        </w:rPr>
+      </w:pPr>
+      <w:r>
+        <w:rPr>
+          <w:rFonts w:ascii="Times New Roman" w:eastAsia="Times New Roman" w:hAnsi="Times New Roman" w:cs="Times New Roman"/>
+          <w:b/>
+          <w:bCs/>
+          <w:sz w:val="26"/>
+          <w:szCs w:val="26"/>
+        </w:rPr>
+        <w:t>Lemeula Renita</w:t>
       </w:r>
     </w:p>
     <w:p>

</xml_diff>

<commit_message>
Per-committee background guide links (Mercatus, Athleticum), Terra +Aarudh Nathan, Veritas name spelling
Co-Authored-By: Claude Fable 5 <noreply@anthropic.com>
</commit_message>
<xml_diff>
--- a/STUFF/CORE SECRETRIAT AND EXECUTIVE BOARD.docx
+++ b/STUFF/CORE SECRETRIAT AND EXECUTIVE BOARD.docx
@@ -644,6 +644,29 @@
           <w:highlight w:val="white"/>
         </w:rPr>
       </w:pPr>
+      <w:r>
+        <w:rPr>
+          <w:rFonts w:ascii="Times New Roman" w:eastAsia="Times New Roman" w:hAnsi="Times New Roman" w:cs="Times New Roman"/>
+          <w:b/>
+          <w:bCs/>
+          <w:sz w:val="26"/>
+          <w:szCs w:val="26"/>
+          <w:highlight w:val="white"/>
+        </w:rPr>
+        <w:t>Aarudh Nathan</w:t>
+      </w:r>
+    </w:p>
+    <w:p>
+      <w:pPr>
+        <w:rPr>
+          <w:rFonts w:ascii="Times New Roman" w:eastAsia="Times New Roman" w:hAnsi="Times New Roman" w:cs="Times New Roman"/>
+          <w:b/>
+          <w:bCs/>
+          <w:sz w:val="26"/>
+          <w:szCs w:val="26"/>
+          <w:highlight w:val="white"/>
+        </w:rPr>
+      </w:pPr>
     </w:p>
     <w:p>
       <w:pPr>
@@ -999,19 +1022,17 @@
           <w:bCs/>
           <w:sz w:val="26"/>
           <w:szCs w:val="26"/>
-          <w:highlight w:val="white"/>
-        </w:rPr>
-      </w:pPr>
-      <w:r>
-        <w:rPr>
-          <w:rFonts w:ascii="Times New Roman" w:eastAsia="Times New Roman" w:hAnsi="Times New Roman" w:cs="Times New Roman"/>
-          <w:b/>
-          <w:bCs/>
-          <w:sz w:val="26"/>
-          <w:szCs w:val="26"/>
-          <w:highlight w:val="white"/>
-        </w:rPr>
-        <w:t>Devamilanie</w:t>
+        </w:rPr>
+      </w:pPr>
+      <w:r>
+        <w:rPr>
+          <w:rFonts w:ascii="Times New Roman" w:eastAsia="Times New Roman" w:hAnsi="Times New Roman" w:cs="Times New Roman"/>
+          <w:b/>
+          <w:bCs/>
+          <w:sz w:val="26"/>
+          <w:szCs w:val="26"/>
+        </w:rPr>
+        <w:t>Devamelanie</w:t>
       </w:r>
     </w:p>
     <w:p>

</xml_diff>